<commit_message>
Climate variables and extreme climate effect plot
Worked to clear up the climate variables and include some node attributes. Also made a nice effect size plot for extreme years. Realized burstiness is not useful for extreme years
</commit_message>
<xml_diff>
--- a/Climate effects on seasonal community transitions9-30.docx
+++ b/Climate effects on seasonal community transitions9-30.docx
@@ -114,7 +114,7 @@
         <w:rPr>
           <w:rFonts w:ascii="Times New Roman" w:hAnsi="Times New Roman" w:cs="Times New Roman"/>
         </w:rPr>
-        <w:t>M</w:t>
+        <w:t>While m</w:t>
       </w:r>
       <w:r>
         <w:rPr>
@@ -156,223 +156,229 @@
         <w:rPr>
           <w:rFonts w:ascii="Times New Roman" w:hAnsi="Times New Roman" w:cs="Times New Roman"/>
         </w:rPr>
+        <w:t xml:space="preserve">, we </w:t>
+      </w:r>
+      <w:r>
+        <w:rPr>
+          <w:rFonts w:ascii="Times New Roman" w:hAnsi="Times New Roman" w:cs="Times New Roman"/>
+        </w:rPr>
+        <w:t xml:space="preserve">still </w:t>
+      </w:r>
+      <w:r>
+        <w:rPr>
+          <w:rFonts w:ascii="Times New Roman" w:hAnsi="Times New Roman" w:cs="Times New Roman"/>
+        </w:rPr>
+        <w:t xml:space="preserve">know </w:t>
+      </w:r>
+      <w:r>
+        <w:rPr>
+          <w:rFonts w:ascii="Times New Roman" w:hAnsi="Times New Roman" w:cs="Times New Roman"/>
+        </w:rPr>
+        <w:t>relatively little about how climate variability influences</w:t>
+      </w:r>
+      <w:r>
+        <w:rPr>
+          <w:rFonts w:ascii="Times New Roman" w:hAnsi="Times New Roman" w:cs="Times New Roman"/>
+        </w:rPr>
+        <w:t xml:space="preserve"> </w:t>
+      </w:r>
+      <w:r>
+        <w:rPr>
+          <w:rFonts w:ascii="Times New Roman" w:hAnsi="Times New Roman" w:cs="Times New Roman"/>
+        </w:rPr>
+        <w:t xml:space="preserve">the temporal </w:t>
+      </w:r>
+      <w:r>
+        <w:rPr>
+          <w:rFonts w:ascii="Times New Roman" w:hAnsi="Times New Roman" w:cs="Times New Roman"/>
+        </w:rPr>
+        <w:t xml:space="preserve">structure </w:t>
+      </w:r>
+      <w:r>
+        <w:rPr>
+          <w:rFonts w:ascii="Times New Roman" w:hAnsi="Times New Roman" w:cs="Times New Roman"/>
+        </w:rPr>
+        <w:t xml:space="preserve">of </w:t>
+      </w:r>
+      <w:r>
+        <w:rPr>
+          <w:rFonts w:ascii="Times New Roman" w:hAnsi="Times New Roman" w:cs="Times New Roman"/>
+        </w:rPr>
+        <w:t xml:space="preserve">ecological </w:t>
+      </w:r>
+      <w:r>
+        <w:rPr>
+          <w:rFonts w:ascii="Times New Roman" w:hAnsi="Times New Roman" w:cs="Times New Roman"/>
+        </w:rPr>
+        <w:t xml:space="preserve">communities. </w:t>
+      </w:r>
+      <w:r>
+        <w:rPr>
+          <w:rFonts w:ascii="Times New Roman" w:hAnsi="Times New Roman" w:cs="Times New Roman"/>
+        </w:rPr>
+        <w:t xml:space="preserve">Ecological </w:t>
+      </w:r>
+      <w:r>
+        <w:rPr>
+          <w:rFonts w:ascii="Times New Roman" w:hAnsi="Times New Roman" w:cs="Times New Roman"/>
+        </w:rPr>
+        <w:t xml:space="preserve">communities are </w:t>
+      </w:r>
+      <w:r>
+        <w:rPr>
+          <w:rFonts w:ascii="Times New Roman" w:hAnsi="Times New Roman" w:cs="Times New Roman"/>
+        </w:rPr>
+        <w:t>not static</w:t>
+      </w:r>
+      <w:r>
+        <w:rPr>
+          <w:rFonts w:ascii="Times New Roman" w:hAnsi="Times New Roman" w:cs="Times New Roman"/>
+        </w:rPr>
+        <w:t xml:space="preserve"> but highly dynamic, constantly changing</w:t>
+      </w:r>
+      <w:r>
+        <w:rPr>
+          <w:rFonts w:ascii="Times New Roman" w:hAnsi="Times New Roman" w:cs="Times New Roman"/>
+        </w:rPr>
+        <w:t xml:space="preserve"> as species </w:t>
+      </w:r>
+      <w:r>
+        <w:rPr>
+          <w:rFonts w:ascii="Times New Roman" w:hAnsi="Times New Roman" w:cs="Times New Roman"/>
+        </w:rPr>
+        <w:t xml:space="preserve">emerge, </w:t>
+      </w:r>
+      <w:r>
+        <w:rPr>
+          <w:rFonts w:ascii="Times New Roman" w:hAnsi="Times New Roman" w:cs="Times New Roman"/>
+        </w:rPr>
+        <w:t xml:space="preserve">become active, </w:t>
+      </w:r>
+      <w:r>
+        <w:rPr>
+          <w:rFonts w:ascii="Times New Roman" w:hAnsi="Times New Roman" w:cs="Times New Roman"/>
+        </w:rPr>
+        <w:t>migrate, reproduce, or become dormant</w:t>
+      </w:r>
+      <w:r>
+        <w:rPr>
+          <w:rFonts w:ascii="Times New Roman" w:hAnsi="Times New Roman" w:cs="Times New Roman"/>
+        </w:rPr>
+        <w:t xml:space="preserve"> at different times of the year</w:t>
+      </w:r>
+      <w:r>
+        <w:rPr>
+          <w:rFonts w:ascii="Times New Roman" w:hAnsi="Times New Roman" w:cs="Times New Roman"/>
+        </w:rPr>
+        <w:t xml:space="preserve">. </w:t>
+      </w:r>
+      <w:r>
+        <w:rPr>
+          <w:rFonts w:ascii="Times New Roman" w:hAnsi="Times New Roman" w:cs="Times New Roman"/>
+        </w:rPr>
+        <w:t>The</w:t>
+      </w:r>
+      <w:r>
+        <w:rPr>
+          <w:rFonts w:ascii="Times New Roman" w:hAnsi="Times New Roman" w:cs="Times New Roman"/>
+        </w:rPr>
+        <w:t>se</w:t>
+      </w:r>
+      <w:r>
+        <w:rPr>
+          <w:rFonts w:ascii="Times New Roman" w:hAnsi="Times New Roman" w:cs="Times New Roman"/>
+        </w:rPr>
+        <w:t xml:space="preserve"> </w:t>
+      </w:r>
+      <w:r>
+        <w:rPr>
+          <w:rFonts w:ascii="Times New Roman" w:hAnsi="Times New Roman" w:cs="Times New Roman"/>
+        </w:rPr>
+        <w:t xml:space="preserve">intra-annual changes </w:t>
+      </w:r>
+      <w:r>
+        <w:rPr>
+          <w:rFonts w:ascii="Times New Roman" w:hAnsi="Times New Roman" w:cs="Times New Roman"/>
+        </w:rPr>
+        <w:t xml:space="preserve">in community structure </w:t>
+      </w:r>
+      <w:r>
+        <w:rPr>
+          <w:rFonts w:ascii="Times New Roman" w:hAnsi="Times New Roman" w:cs="Times New Roman"/>
+        </w:rPr>
+        <w:t xml:space="preserve">are </w:t>
+      </w:r>
+      <w:r>
+        <w:rPr>
+          <w:rFonts w:ascii="Times New Roman" w:hAnsi="Times New Roman" w:cs="Times New Roman"/>
+        </w:rPr>
+        <w:t xml:space="preserve">significant </w:t>
+      </w:r>
+      <w:r>
+        <w:rPr>
+          <w:rFonts w:ascii="Times New Roman" w:hAnsi="Times New Roman" w:cs="Times New Roman"/>
+        </w:rPr>
+        <w:t xml:space="preserve">because their sequence and timing define </w:t>
+      </w:r>
+      <w:r>
+        <w:rPr>
+          <w:rFonts w:ascii="Times New Roman" w:hAnsi="Times New Roman" w:cs="Times New Roman"/>
+        </w:rPr>
+        <w:t>species interactions</w:t>
+      </w:r>
+      <w:r>
+        <w:rPr>
+          <w:rFonts w:ascii="Times New Roman" w:hAnsi="Times New Roman" w:cs="Times New Roman"/>
+        </w:rPr>
+        <w:t>,</w:t>
+      </w:r>
+      <w:r>
+        <w:rPr>
+          <w:rFonts w:ascii="Times New Roman" w:hAnsi="Times New Roman" w:cs="Times New Roman"/>
+        </w:rPr>
+        <w:t xml:space="preserve"> energy</w:t>
+      </w:r>
+      <w:r>
+        <w:rPr>
+          <w:rFonts w:ascii="Times New Roman" w:hAnsi="Times New Roman" w:cs="Times New Roman"/>
+        </w:rPr>
+        <w:t xml:space="preserve"> flow</w:t>
+      </w:r>
+      <w:r>
+        <w:rPr>
+          <w:rFonts w:ascii="Times New Roman" w:hAnsi="Times New Roman" w:cs="Times New Roman"/>
+        </w:rPr>
         <w:t xml:space="preserve">, </w:t>
       </w:r>
       <w:r>
         <w:rPr>
           <w:rFonts w:ascii="Times New Roman" w:hAnsi="Times New Roman" w:cs="Times New Roman"/>
         </w:rPr>
-        <w:t xml:space="preserve">but </w:t>
-      </w:r>
-      <w:r>
-        <w:rPr>
-          <w:rFonts w:ascii="Times New Roman" w:hAnsi="Times New Roman" w:cs="Times New Roman"/>
-        </w:rPr>
-        <w:t xml:space="preserve">we know </w:t>
-      </w:r>
-      <w:r>
-        <w:rPr>
-          <w:rFonts w:ascii="Times New Roman" w:hAnsi="Times New Roman" w:cs="Times New Roman"/>
-        </w:rPr>
-        <w:t>relatively little about how climate variability influences</w:t>
+        <w:t>disease transmission, and how ecosystems</w:t>
+      </w:r>
+      <w:r>
+        <w:rPr>
+          <w:rFonts w:ascii="Times New Roman" w:hAnsi="Times New Roman" w:cs="Times New Roman"/>
+        </w:rPr>
+        <w:t xml:space="preserve"> respond to perturbations</w:t>
+      </w:r>
+      <w:r>
+        <w:rPr>
+          <w:rFonts w:ascii="Times New Roman" w:hAnsi="Times New Roman" w:cs="Times New Roman"/>
+        </w:rPr>
+        <w:t xml:space="preserve">. </w:t>
+      </w:r>
+      <w:r>
+        <w:rPr>
+          <w:rFonts w:ascii="Times New Roman" w:hAnsi="Times New Roman" w:cs="Times New Roman"/>
+        </w:rPr>
+        <w:t>Yet,</w:t>
       </w:r>
       <w:r>
         <w:rPr>
           <w:rFonts w:ascii="Times New Roman" w:hAnsi="Times New Roman" w:cs="Times New Roman"/>
         </w:rPr>
         <w:t xml:space="preserve"> </w:t>
-      </w:r>
-      <w:r>
-        <w:rPr>
-          <w:rFonts w:ascii="Times New Roman" w:hAnsi="Times New Roman" w:cs="Times New Roman"/>
-        </w:rPr>
-        <w:t xml:space="preserve">the temporal </w:t>
-      </w:r>
-      <w:r>
-        <w:rPr>
-          <w:rFonts w:ascii="Times New Roman" w:hAnsi="Times New Roman" w:cs="Times New Roman"/>
-        </w:rPr>
-        <w:t xml:space="preserve">structure </w:t>
-      </w:r>
-      <w:r>
-        <w:rPr>
-          <w:rFonts w:ascii="Times New Roman" w:hAnsi="Times New Roman" w:cs="Times New Roman"/>
-        </w:rPr>
-        <w:t xml:space="preserve">of </w:t>
-      </w:r>
-      <w:r>
-        <w:rPr>
-          <w:rFonts w:ascii="Times New Roman" w:hAnsi="Times New Roman" w:cs="Times New Roman"/>
-        </w:rPr>
-        <w:t xml:space="preserve">ecological </w:t>
-      </w:r>
-      <w:r>
-        <w:rPr>
-          <w:rFonts w:ascii="Times New Roman" w:hAnsi="Times New Roman" w:cs="Times New Roman"/>
-        </w:rPr>
-        <w:t xml:space="preserve">communities. </w:t>
-      </w:r>
-      <w:r>
-        <w:rPr>
-          <w:rFonts w:ascii="Times New Roman" w:hAnsi="Times New Roman" w:cs="Times New Roman"/>
-        </w:rPr>
-        <w:t xml:space="preserve">Ecological </w:t>
-      </w:r>
-      <w:r>
-        <w:rPr>
-          <w:rFonts w:ascii="Times New Roman" w:hAnsi="Times New Roman" w:cs="Times New Roman"/>
-        </w:rPr>
-        <w:t xml:space="preserve">communities are </w:t>
-      </w:r>
-      <w:r>
-        <w:rPr>
-          <w:rFonts w:ascii="Times New Roman" w:hAnsi="Times New Roman" w:cs="Times New Roman"/>
-        </w:rPr>
-        <w:t>not static</w:t>
-      </w:r>
-      <w:r>
-        <w:rPr>
-          <w:rFonts w:ascii="Times New Roman" w:hAnsi="Times New Roman" w:cs="Times New Roman"/>
-        </w:rPr>
-        <w:t xml:space="preserve"> but highly dynamic, constantly changing</w:t>
-      </w:r>
-      <w:r>
-        <w:rPr>
-          <w:rFonts w:ascii="Times New Roman" w:hAnsi="Times New Roman" w:cs="Times New Roman"/>
-        </w:rPr>
-        <w:t xml:space="preserve"> as species </w:t>
-      </w:r>
-      <w:r>
-        <w:rPr>
-          <w:rFonts w:ascii="Times New Roman" w:hAnsi="Times New Roman" w:cs="Times New Roman"/>
-        </w:rPr>
-        <w:t xml:space="preserve">emerge, </w:t>
-      </w:r>
-      <w:r>
-        <w:rPr>
-          <w:rFonts w:ascii="Times New Roman" w:hAnsi="Times New Roman" w:cs="Times New Roman"/>
-        </w:rPr>
-        <w:t xml:space="preserve">become active, </w:t>
-      </w:r>
-      <w:r>
-        <w:rPr>
-          <w:rFonts w:ascii="Times New Roman" w:hAnsi="Times New Roman" w:cs="Times New Roman"/>
-        </w:rPr>
-        <w:t>migrate, reproduce, or become dormant</w:t>
-      </w:r>
-      <w:r>
-        <w:rPr>
-          <w:rFonts w:ascii="Times New Roman" w:hAnsi="Times New Roman" w:cs="Times New Roman"/>
-        </w:rPr>
-        <w:t xml:space="preserve"> at different times of the year</w:t>
-      </w:r>
-      <w:r>
-        <w:rPr>
-          <w:rFonts w:ascii="Times New Roman" w:hAnsi="Times New Roman" w:cs="Times New Roman"/>
-        </w:rPr>
-        <w:t xml:space="preserve">. </w:t>
-      </w:r>
-      <w:r>
-        <w:rPr>
-          <w:rFonts w:ascii="Times New Roman" w:hAnsi="Times New Roman" w:cs="Times New Roman"/>
-        </w:rPr>
-        <w:t>The</w:t>
-      </w:r>
-      <w:r>
-        <w:rPr>
-          <w:rFonts w:ascii="Times New Roman" w:hAnsi="Times New Roman" w:cs="Times New Roman"/>
-        </w:rPr>
-        <w:t>se</w:t>
-      </w:r>
-      <w:r>
-        <w:rPr>
-          <w:rFonts w:ascii="Times New Roman" w:hAnsi="Times New Roman" w:cs="Times New Roman"/>
-        </w:rPr>
-        <w:t xml:space="preserve"> </w:t>
-      </w:r>
-      <w:r>
-        <w:rPr>
-          <w:rFonts w:ascii="Times New Roman" w:hAnsi="Times New Roman" w:cs="Times New Roman"/>
-        </w:rPr>
-        <w:t xml:space="preserve">intra-annual changes </w:t>
-      </w:r>
-      <w:r>
-        <w:rPr>
-          <w:rFonts w:ascii="Times New Roman" w:hAnsi="Times New Roman" w:cs="Times New Roman"/>
-        </w:rPr>
-        <w:t xml:space="preserve">in community structure </w:t>
-      </w:r>
-      <w:r>
-        <w:rPr>
-          <w:rFonts w:ascii="Times New Roman" w:hAnsi="Times New Roman" w:cs="Times New Roman"/>
-        </w:rPr>
-        <w:t xml:space="preserve">are </w:t>
-      </w:r>
-      <w:r>
-        <w:rPr>
-          <w:rFonts w:ascii="Times New Roman" w:hAnsi="Times New Roman" w:cs="Times New Roman"/>
-        </w:rPr>
-        <w:t xml:space="preserve">significant </w:t>
-      </w:r>
-      <w:r>
-        <w:rPr>
-          <w:rFonts w:ascii="Times New Roman" w:hAnsi="Times New Roman" w:cs="Times New Roman"/>
-        </w:rPr>
-        <w:t xml:space="preserve">because their sequence and timing define </w:t>
-      </w:r>
-      <w:r>
-        <w:rPr>
-          <w:rFonts w:ascii="Times New Roman" w:hAnsi="Times New Roman" w:cs="Times New Roman"/>
-        </w:rPr>
-        <w:t>species interactions</w:t>
-      </w:r>
-      <w:r>
-        <w:rPr>
-          <w:rFonts w:ascii="Times New Roman" w:hAnsi="Times New Roman" w:cs="Times New Roman"/>
-        </w:rPr>
-        <w:t>,</w:t>
-      </w:r>
-      <w:r>
-        <w:rPr>
-          <w:rFonts w:ascii="Times New Roman" w:hAnsi="Times New Roman" w:cs="Times New Roman"/>
-        </w:rPr>
-        <w:t xml:space="preserve"> energy</w:t>
-      </w:r>
-      <w:r>
-        <w:rPr>
-          <w:rFonts w:ascii="Times New Roman" w:hAnsi="Times New Roman" w:cs="Times New Roman"/>
-        </w:rPr>
-        <w:t xml:space="preserve"> flow</w:t>
-      </w:r>
-      <w:r>
-        <w:rPr>
-          <w:rFonts w:ascii="Times New Roman" w:hAnsi="Times New Roman" w:cs="Times New Roman"/>
-        </w:rPr>
-        <w:t xml:space="preserve">, </w:t>
-      </w:r>
-      <w:r>
-        <w:rPr>
-          <w:rFonts w:ascii="Times New Roman" w:hAnsi="Times New Roman" w:cs="Times New Roman"/>
-        </w:rPr>
-        <w:t>disease transmission, and how ecosystems</w:t>
-      </w:r>
-      <w:r>
-        <w:rPr>
-          <w:rFonts w:ascii="Times New Roman" w:hAnsi="Times New Roman" w:cs="Times New Roman"/>
-        </w:rPr>
-        <w:t xml:space="preserve"> respond to perturbations</w:t>
-      </w:r>
-      <w:r>
-        <w:rPr>
-          <w:rFonts w:ascii="Times New Roman" w:hAnsi="Times New Roman" w:cs="Times New Roman"/>
-        </w:rPr>
-        <w:t xml:space="preserve">. </w:t>
-      </w:r>
-      <w:r>
-        <w:rPr>
-          <w:rFonts w:ascii="Times New Roman" w:hAnsi="Times New Roman" w:cs="Times New Roman"/>
-        </w:rPr>
-        <w:t xml:space="preserve">Despite their importance, </w:t>
       </w:r>
       <w:r>
         <w:rPr>
@@ -435,488 +441,45 @@
         <w:rPr>
           <w:rFonts w:ascii="Times New Roman" w:hAnsi="Times New Roman" w:cs="Times New Roman"/>
         </w:rPr>
-        <w:t>Most p</w:t>
-      </w:r>
-      <w:r>
-        <w:rPr>
-          <w:rFonts w:ascii="Times New Roman" w:hAnsi="Times New Roman" w:cs="Times New Roman"/>
-        </w:rPr>
-        <w:t>revious work on intra-annual (or seasonal) community patterns ha</w:t>
-      </w:r>
-      <w:r>
-        <w:rPr>
-          <w:rFonts w:ascii="Times New Roman" w:hAnsi="Times New Roman" w:cs="Times New Roman"/>
-        </w:rPr>
-        <w:t>s</w:t>
+        <w:t xml:space="preserve">The temporal structure of communities emerges from the phenological responses of individual species, which rarely respond to environmental changes in perfect synchrony. Instead, community members can differ in the rate and even direction at which phenologies shift in response to climate change. These individual differences can scale up to alter the entire temporal organization of communities. For instance, by altering the relative timing and/or spacing between phenologies, extreme climate events could alter the timing, duration, and even </w:t>
+      </w:r>
+      <w:r>
+        <w:rPr>
+          <w:rFonts w:ascii="Times New Roman" w:hAnsi="Times New Roman" w:cs="Times New Roman"/>
+        </w:rPr>
+        <w:t xml:space="preserve">the </w:t>
+      </w:r>
+      <w:r>
+        <w:rPr>
+          <w:rFonts w:ascii="Times New Roman" w:hAnsi="Times New Roman" w:cs="Times New Roman"/>
+        </w:rPr>
+        <w:t xml:space="preserve">diversity of unique community states and their sequence throughout the year. These effects could be correlated across local communities if species experience the same climatic conditions, or they could be modulated by local biotic and abiotic </w:t>
+      </w:r>
+      <w:commentRangeStart w:id="0"/>
+      <w:r>
+        <w:rPr>
+          <w:rFonts w:ascii="Times New Roman" w:hAnsi="Times New Roman" w:cs="Times New Roman"/>
+        </w:rPr>
+        <w:t>conditions</w:t>
+      </w:r>
+      <w:commentRangeEnd w:id="0"/>
+      <w:r>
+        <w:rPr>
+          <w:rStyle w:val="CommentReference"/>
+        </w:rPr>
+        <w:commentReference w:id="0"/>
+      </w:r>
+      <w:r>
+        <w:rPr>
+          <w:rFonts w:ascii="Times New Roman" w:hAnsi="Times New Roman" w:cs="Times New Roman"/>
+        </w:rPr>
+        <w:t>.</w:t>
       </w:r>
       <w:r>
         <w:rPr>
           <w:rFonts w:ascii="Times New Roman" w:hAnsi="Times New Roman" w:cs="Times New Roman"/>
         </w:rPr>
         <w:t xml:space="preserve"> </w:t>
-      </w:r>
-      <w:r>
-        <w:rPr>
-          <w:rFonts w:ascii="Times New Roman" w:hAnsi="Times New Roman" w:cs="Times New Roman"/>
-        </w:rPr>
-        <w:t xml:space="preserve">taken </w:t>
-      </w:r>
-      <w:r>
-        <w:rPr>
-          <w:rFonts w:ascii="Times New Roman" w:hAnsi="Times New Roman" w:cs="Times New Roman"/>
-        </w:rPr>
-        <w:t>a snapshot approach</w:t>
-      </w:r>
-      <w:r>
-        <w:rPr>
-          <w:rFonts w:ascii="Times New Roman" w:hAnsi="Times New Roman" w:cs="Times New Roman"/>
-        </w:rPr>
-        <w:t xml:space="preserve">, which compares </w:t>
-      </w:r>
-      <w:r>
-        <w:rPr>
-          <w:rFonts w:ascii="Times New Roman" w:hAnsi="Times New Roman" w:cs="Times New Roman"/>
-        </w:rPr>
-        <w:t>species richness</w:t>
-      </w:r>
-      <w:r>
-        <w:rPr>
-          <w:rFonts w:ascii="Times New Roman" w:hAnsi="Times New Roman" w:cs="Times New Roman"/>
-        </w:rPr>
-        <w:t>,</w:t>
-      </w:r>
-      <w:r>
-        <w:rPr>
-          <w:rFonts w:ascii="Times New Roman" w:hAnsi="Times New Roman" w:cs="Times New Roman"/>
-        </w:rPr>
-        <w:t xml:space="preserve"> diversity</w:t>
-      </w:r>
-      <w:r>
-        <w:rPr>
-          <w:rFonts w:ascii="Times New Roman" w:hAnsi="Times New Roman" w:cs="Times New Roman"/>
-        </w:rPr>
-        <w:t>, or interaction networks</w:t>
-      </w:r>
-      <w:r>
-        <w:rPr>
-          <w:rFonts w:ascii="Times New Roman" w:hAnsi="Times New Roman" w:cs="Times New Roman"/>
-        </w:rPr>
-        <w:t xml:space="preserve"> </w:t>
-      </w:r>
-      <w:r>
-        <w:rPr>
-          <w:rFonts w:ascii="Times New Roman" w:hAnsi="Times New Roman" w:cs="Times New Roman"/>
-        </w:rPr>
-        <w:t xml:space="preserve">at discrete </w:t>
-      </w:r>
-      <w:r>
-        <w:rPr>
-          <w:rFonts w:ascii="Times New Roman" w:hAnsi="Times New Roman" w:cs="Times New Roman"/>
-        </w:rPr>
-        <w:t>time</w:t>
-      </w:r>
-      <w:r>
-        <w:rPr>
-          <w:rFonts w:ascii="Times New Roman" w:hAnsi="Times New Roman" w:cs="Times New Roman"/>
-        </w:rPr>
-        <w:t xml:space="preserve"> points</w:t>
-      </w:r>
-      <w:r>
-        <w:rPr>
-          <w:rFonts w:ascii="Times New Roman" w:hAnsi="Times New Roman" w:cs="Times New Roman"/>
-        </w:rPr>
-        <w:t xml:space="preserve">. </w:t>
-      </w:r>
-      <w:r>
-        <w:rPr>
-          <w:rFonts w:ascii="Times New Roman" w:hAnsi="Times New Roman" w:cs="Times New Roman"/>
-        </w:rPr>
-        <w:t>T</w:t>
-      </w:r>
-      <w:r>
-        <w:rPr>
-          <w:rFonts w:ascii="Times New Roman" w:hAnsi="Times New Roman" w:cs="Times New Roman"/>
-        </w:rPr>
-        <w:t xml:space="preserve">hese studies </w:t>
-      </w:r>
-      <w:r>
-        <w:rPr>
-          <w:rFonts w:ascii="Times New Roman" w:hAnsi="Times New Roman" w:cs="Times New Roman"/>
-        </w:rPr>
-        <w:t xml:space="preserve">have </w:t>
-      </w:r>
-      <w:r>
-        <w:rPr>
-          <w:rFonts w:ascii="Times New Roman" w:hAnsi="Times New Roman" w:cs="Times New Roman"/>
-        </w:rPr>
-        <w:t xml:space="preserve">highlighted the dynamic nature of natural communities and </w:t>
-      </w:r>
-      <w:r>
-        <w:rPr>
-          <w:rFonts w:ascii="Times New Roman" w:hAnsi="Times New Roman" w:cs="Times New Roman"/>
-        </w:rPr>
-        <w:t xml:space="preserve">revealed </w:t>
-      </w:r>
-      <w:r>
-        <w:rPr>
-          <w:rFonts w:ascii="Times New Roman" w:hAnsi="Times New Roman" w:cs="Times New Roman"/>
-        </w:rPr>
-        <w:t xml:space="preserve">broad seasonal </w:t>
-      </w:r>
-      <w:r>
-        <w:rPr>
-          <w:rFonts w:ascii="Times New Roman" w:hAnsi="Times New Roman" w:cs="Times New Roman"/>
-        </w:rPr>
-        <w:t>patterns</w:t>
-      </w:r>
-      <w:r>
-        <w:rPr>
-          <w:rFonts w:ascii="Times New Roman" w:hAnsi="Times New Roman" w:cs="Times New Roman"/>
-        </w:rPr>
-        <w:t>, such as</w:t>
-      </w:r>
-      <w:r>
-        <w:rPr>
-          <w:rFonts w:ascii="Times New Roman" w:hAnsi="Times New Roman" w:cs="Times New Roman"/>
-        </w:rPr>
-        <w:t xml:space="preserve"> seasonal richness (diversity) relationships</w:t>
-      </w:r>
-      <w:r>
-        <w:rPr>
-          <w:rFonts w:ascii="Times New Roman" w:hAnsi="Times New Roman" w:cs="Times New Roman"/>
-        </w:rPr>
-        <w:t>,</w:t>
-      </w:r>
-      <w:r>
-        <w:rPr>
-          <w:rFonts w:ascii="Times New Roman" w:hAnsi="Times New Roman" w:cs="Times New Roman"/>
-        </w:rPr>
-        <w:t xml:space="preserve"> </w:t>
-      </w:r>
-      <w:r>
-        <w:rPr>
-          <w:rFonts w:ascii="Times New Roman" w:hAnsi="Times New Roman" w:cs="Times New Roman"/>
-        </w:rPr>
-        <w:t xml:space="preserve">and </w:t>
-      </w:r>
-      <w:r>
-        <w:rPr>
-          <w:rFonts w:ascii="Times New Roman" w:hAnsi="Times New Roman" w:cs="Times New Roman"/>
-        </w:rPr>
-        <w:t xml:space="preserve">how they differ </w:t>
-      </w:r>
-      <w:r>
-        <w:rPr>
-          <w:rFonts w:ascii="Times New Roman" w:hAnsi="Times New Roman" w:cs="Times New Roman"/>
-        </w:rPr>
-        <w:t>across regions</w:t>
-      </w:r>
-      <w:r>
-        <w:rPr>
-          <w:rFonts w:ascii="Times New Roman" w:hAnsi="Times New Roman" w:cs="Times New Roman"/>
-        </w:rPr>
-        <w:t xml:space="preserve">. </w:t>
-      </w:r>
-      <w:r>
-        <w:rPr>
-          <w:rFonts w:ascii="Times New Roman" w:hAnsi="Times New Roman" w:cs="Times New Roman"/>
-        </w:rPr>
-        <w:t xml:space="preserve">However, this </w:t>
-      </w:r>
-      <w:r>
-        <w:rPr>
-          <w:rFonts w:ascii="Times New Roman" w:hAnsi="Times New Roman" w:cs="Times New Roman"/>
-        </w:rPr>
-        <w:t xml:space="preserve">framework </w:t>
-      </w:r>
-      <w:r>
-        <w:rPr>
-          <w:rFonts w:ascii="Times New Roman" w:hAnsi="Times New Roman" w:cs="Times New Roman"/>
-        </w:rPr>
-        <w:t xml:space="preserve">often </w:t>
-      </w:r>
-      <w:r>
-        <w:rPr>
-          <w:rFonts w:ascii="Times New Roman" w:hAnsi="Times New Roman" w:cs="Times New Roman"/>
-        </w:rPr>
-        <w:t xml:space="preserve">overlooks the deeper </w:t>
-      </w:r>
-      <w:r>
-        <w:rPr>
-          <w:rFonts w:ascii="Times New Roman" w:hAnsi="Times New Roman" w:cs="Times New Roman"/>
-        </w:rPr>
-        <w:t xml:space="preserve">temporal </w:t>
-      </w:r>
-      <w:r>
-        <w:rPr>
-          <w:rFonts w:ascii="Times New Roman" w:hAnsi="Times New Roman" w:cs="Times New Roman"/>
-        </w:rPr>
-        <w:t>organization of communities</w:t>
-      </w:r>
-      <w:r>
-        <w:rPr>
-          <w:rFonts w:ascii="Times New Roman" w:hAnsi="Times New Roman" w:cs="Times New Roman"/>
-        </w:rPr>
-        <w:t xml:space="preserve">, </w:t>
-      </w:r>
-      <w:r>
-        <w:rPr>
-          <w:rFonts w:ascii="Times New Roman" w:hAnsi="Times New Roman" w:cs="Times New Roman"/>
-        </w:rPr>
-        <w:t xml:space="preserve">like </w:t>
-      </w:r>
-      <w:r>
-        <w:rPr>
-          <w:rFonts w:ascii="Times New Roman" w:hAnsi="Times New Roman" w:cs="Times New Roman"/>
-        </w:rPr>
-        <w:t>how long a community state persists</w:t>
-      </w:r>
-      <w:r>
-        <w:rPr>
-          <w:rFonts w:ascii="Times New Roman" w:hAnsi="Times New Roman" w:cs="Times New Roman"/>
-        </w:rPr>
-        <w:t>,</w:t>
-      </w:r>
-      <w:r>
-        <w:rPr>
-          <w:rFonts w:ascii="Times New Roman" w:hAnsi="Times New Roman" w:cs="Times New Roman"/>
-        </w:rPr>
-        <w:t xml:space="preserve"> </w:t>
-      </w:r>
-      <w:r>
-        <w:rPr>
-          <w:rFonts w:ascii="Times New Roman" w:hAnsi="Times New Roman" w:cs="Times New Roman"/>
-        </w:rPr>
-        <w:t>the sequence and timing of transitions</w:t>
-      </w:r>
-      <w:r>
-        <w:rPr>
-          <w:rFonts w:ascii="Times New Roman" w:hAnsi="Times New Roman" w:cs="Times New Roman"/>
-        </w:rPr>
-        <w:t xml:space="preserve"> between them</w:t>
-      </w:r>
-      <w:r>
-        <w:rPr>
-          <w:rFonts w:ascii="Times New Roman" w:hAnsi="Times New Roman" w:cs="Times New Roman"/>
-        </w:rPr>
-        <w:t>, or how predictable these patterns are</w:t>
-      </w:r>
-      <w:r>
-        <w:rPr>
-          <w:rFonts w:ascii="Times New Roman" w:hAnsi="Times New Roman" w:cs="Times New Roman"/>
-        </w:rPr>
-        <w:t>.</w:t>
-      </w:r>
-      <w:r>
-        <w:rPr>
-          <w:rFonts w:ascii="Times New Roman" w:hAnsi="Times New Roman" w:cs="Times New Roman"/>
-        </w:rPr>
-        <w:t xml:space="preserve"> </w:t>
-      </w:r>
-      <w:r>
-        <w:rPr>
-          <w:rFonts w:ascii="Times New Roman" w:hAnsi="Times New Roman" w:cs="Times New Roman"/>
-        </w:rPr>
-        <w:t>Consequently</w:t>
-      </w:r>
-      <w:r>
-        <w:rPr>
-          <w:rFonts w:ascii="Times New Roman" w:hAnsi="Times New Roman" w:cs="Times New Roman"/>
-        </w:rPr>
-        <w:t xml:space="preserve">, many fundamental </w:t>
-      </w:r>
-      <w:r>
-        <w:rPr>
-          <w:rFonts w:ascii="Times New Roman" w:hAnsi="Times New Roman" w:cs="Times New Roman"/>
-        </w:rPr>
-        <w:t xml:space="preserve">questions </w:t>
-      </w:r>
-      <w:r>
-        <w:rPr>
-          <w:rFonts w:ascii="Times New Roman" w:hAnsi="Times New Roman" w:cs="Times New Roman"/>
-        </w:rPr>
-        <w:t xml:space="preserve">about the temporal organization of communities </w:t>
-      </w:r>
-      <w:r>
-        <w:rPr>
-          <w:rFonts w:ascii="Times New Roman" w:hAnsi="Times New Roman" w:cs="Times New Roman"/>
-        </w:rPr>
-        <w:t>remain unanswered</w:t>
-      </w:r>
-      <w:r>
-        <w:rPr>
-          <w:rFonts w:ascii="Times New Roman" w:hAnsi="Times New Roman" w:cs="Times New Roman"/>
-        </w:rPr>
-        <w:t xml:space="preserve">. </w:t>
-      </w:r>
-      <w:r>
-        <w:rPr>
-          <w:rFonts w:ascii="Times New Roman" w:hAnsi="Times New Roman" w:cs="Times New Roman"/>
-        </w:rPr>
-        <w:t xml:space="preserve">Do communities typically </w:t>
-      </w:r>
-      <w:r>
-        <w:rPr>
-          <w:rFonts w:ascii="Times New Roman" w:hAnsi="Times New Roman" w:cs="Times New Roman"/>
-        </w:rPr>
-        <w:t xml:space="preserve">follow </w:t>
-      </w:r>
-      <w:r>
-        <w:rPr>
-          <w:rFonts w:ascii="Times New Roman" w:hAnsi="Times New Roman" w:cs="Times New Roman"/>
-        </w:rPr>
-        <w:t xml:space="preserve">a linear succession of unique </w:t>
-      </w:r>
-      <w:r>
-        <w:rPr>
-          <w:rFonts w:ascii="Times New Roman" w:hAnsi="Times New Roman" w:cs="Times New Roman"/>
-        </w:rPr>
-        <w:t>community states</w:t>
-      </w:r>
-      <w:r>
-        <w:rPr>
-          <w:rFonts w:ascii="Times New Roman" w:hAnsi="Times New Roman" w:cs="Times New Roman"/>
-        </w:rPr>
-        <w:t xml:space="preserve">, or do they </w:t>
-      </w:r>
-      <w:r>
-        <w:rPr>
-          <w:rFonts w:ascii="Times New Roman" w:hAnsi="Times New Roman" w:cs="Times New Roman"/>
-        </w:rPr>
-        <w:t>cycle between recurring states</w:t>
-      </w:r>
-      <w:r>
-        <w:rPr>
-          <w:rFonts w:ascii="Times New Roman" w:hAnsi="Times New Roman" w:cs="Times New Roman"/>
-        </w:rPr>
-        <w:t xml:space="preserve">? </w:t>
-      </w:r>
-      <w:r>
-        <w:rPr>
-          <w:rFonts w:ascii="Times New Roman" w:hAnsi="Times New Roman" w:cs="Times New Roman"/>
-        </w:rPr>
-        <w:t xml:space="preserve">Are transitions between states clustered in time, evenly spaced, or </w:t>
-      </w:r>
-      <w:r>
-        <w:rPr>
-          <w:rFonts w:ascii="Times New Roman" w:hAnsi="Times New Roman" w:cs="Times New Roman"/>
-        </w:rPr>
-        <w:lastRenderedPageBreak/>
-        <w:t xml:space="preserve">random? </w:t>
-      </w:r>
-      <w:r>
-        <w:rPr>
-          <w:rFonts w:ascii="Times New Roman" w:hAnsi="Times New Roman" w:cs="Times New Roman"/>
-        </w:rPr>
-        <w:t>H</w:t>
-      </w:r>
-      <w:r>
-        <w:rPr>
-          <w:rFonts w:ascii="Times New Roman" w:hAnsi="Times New Roman" w:cs="Times New Roman"/>
-        </w:rPr>
-        <w:t xml:space="preserve">ow stable </w:t>
-      </w:r>
-      <w:r>
-        <w:rPr>
-          <w:rFonts w:ascii="Times New Roman" w:hAnsi="Times New Roman" w:cs="Times New Roman"/>
-        </w:rPr>
-        <w:t xml:space="preserve">are </w:t>
-      </w:r>
-      <w:r>
-        <w:rPr>
-          <w:rFonts w:ascii="Times New Roman" w:hAnsi="Times New Roman" w:cs="Times New Roman"/>
-        </w:rPr>
-        <w:t xml:space="preserve">these </w:t>
-      </w:r>
-      <w:r>
-        <w:rPr>
-          <w:rFonts w:ascii="Times New Roman" w:hAnsi="Times New Roman" w:cs="Times New Roman"/>
-        </w:rPr>
-        <w:t xml:space="preserve">temporal </w:t>
-      </w:r>
-      <w:r>
-        <w:rPr>
-          <w:rFonts w:ascii="Times New Roman" w:hAnsi="Times New Roman" w:cs="Times New Roman"/>
-        </w:rPr>
-        <w:t>patterns</w:t>
-      </w:r>
-      <w:r>
-        <w:rPr>
-          <w:rFonts w:ascii="Times New Roman" w:hAnsi="Times New Roman" w:cs="Times New Roman"/>
-        </w:rPr>
-        <w:t xml:space="preserve"> across time and space</w:t>
-      </w:r>
-      <w:r>
-        <w:rPr>
-          <w:rFonts w:ascii="Times New Roman" w:hAnsi="Times New Roman" w:cs="Times New Roman"/>
-        </w:rPr>
-        <w:t>?</w:t>
-      </w:r>
-      <w:r>
-        <w:rPr>
-          <w:rFonts w:ascii="Times New Roman" w:hAnsi="Times New Roman" w:cs="Times New Roman"/>
-        </w:rPr>
-        <w:t xml:space="preserve"> </w:t>
-      </w:r>
-      <w:r>
-        <w:rPr>
-          <w:rFonts w:ascii="Times New Roman" w:hAnsi="Times New Roman" w:cs="Times New Roman"/>
-        </w:rPr>
-        <w:t xml:space="preserve">And critically, </w:t>
-      </w:r>
-      <w:r>
-        <w:rPr>
-          <w:rFonts w:ascii="Times New Roman" w:hAnsi="Times New Roman" w:cs="Times New Roman"/>
-        </w:rPr>
-        <w:t xml:space="preserve">how </w:t>
-      </w:r>
-      <w:r>
-        <w:rPr>
-          <w:rFonts w:ascii="Times New Roman" w:hAnsi="Times New Roman" w:cs="Times New Roman"/>
-        </w:rPr>
-        <w:t>does climate</w:t>
-      </w:r>
-      <w:r>
-        <w:rPr>
-          <w:rFonts w:ascii="Times New Roman" w:hAnsi="Times New Roman" w:cs="Times New Roman"/>
-        </w:rPr>
-        <w:t xml:space="preserve"> variability</w:t>
-      </w:r>
-      <w:r>
-        <w:rPr>
-          <w:rFonts w:ascii="Times New Roman" w:hAnsi="Times New Roman" w:cs="Times New Roman"/>
-        </w:rPr>
-        <w:t xml:space="preserve">, particularly extreme weather events, </w:t>
-      </w:r>
-      <w:r>
-        <w:rPr>
-          <w:rFonts w:ascii="Times New Roman" w:hAnsi="Times New Roman" w:cs="Times New Roman"/>
-        </w:rPr>
-        <w:t xml:space="preserve">shape these </w:t>
-      </w:r>
-      <w:r>
-        <w:rPr>
-          <w:rFonts w:ascii="Times New Roman" w:hAnsi="Times New Roman" w:cs="Times New Roman"/>
-        </w:rPr>
-        <w:t>temporal patterns</w:t>
-      </w:r>
-      <w:r>
-        <w:rPr>
-          <w:rFonts w:ascii="Times New Roman" w:hAnsi="Times New Roman" w:cs="Times New Roman"/>
-        </w:rPr>
-        <w:t>?</w:t>
-      </w:r>
-      <w:r>
-        <w:rPr>
-          <w:rFonts w:ascii="Times New Roman" w:hAnsi="Times New Roman" w:cs="Times New Roman"/>
-        </w:rPr>
-        <w:t xml:space="preserve"> </w:t>
-      </w:r>
-      <w:r>
-        <w:rPr>
-          <w:rFonts w:ascii="Times New Roman" w:hAnsi="Times New Roman" w:cs="Times New Roman"/>
-        </w:rPr>
-        <w:t xml:space="preserve">Filling these knowledge gaps is particularly pressing in the face of rapid climate change. </w:t>
       </w:r>
     </w:p>
     <w:p>
@@ -931,37 +494,92 @@
         <w:rPr>
           <w:rFonts w:ascii="Times New Roman" w:hAnsi="Times New Roman" w:cs="Times New Roman"/>
         </w:rPr>
-        <w:t xml:space="preserve">The temporal structure of communities emerges from the phenological responses of individual species, which rarely respond to environmental changes in perfect synchrony. </w:t>
-      </w:r>
-      <w:r>
-        <w:rPr>
-          <w:rFonts w:ascii="Times New Roman" w:hAnsi="Times New Roman" w:cs="Times New Roman"/>
-        </w:rPr>
-        <w:t xml:space="preserve">For instance, community members can differ in the </w:t>
-      </w:r>
-      <w:r>
-        <w:rPr>
-          <w:rFonts w:ascii="Times New Roman" w:hAnsi="Times New Roman" w:cs="Times New Roman"/>
-        </w:rPr>
-        <w:t xml:space="preserve">rate </w:t>
-      </w:r>
-      <w:r>
-        <w:rPr>
-          <w:rFonts w:ascii="Times New Roman" w:hAnsi="Times New Roman" w:cs="Times New Roman"/>
-        </w:rPr>
-        <w:t xml:space="preserve">and even direction </w:t>
-      </w:r>
-      <w:r>
-        <w:rPr>
-          <w:rFonts w:ascii="Times New Roman" w:hAnsi="Times New Roman" w:cs="Times New Roman"/>
-        </w:rPr>
-        <w:t xml:space="preserve">at which phenologies shift </w:t>
-      </w:r>
-      <w:r>
-        <w:rPr>
-          <w:rFonts w:ascii="Times New Roman" w:hAnsi="Times New Roman" w:cs="Times New Roman"/>
-        </w:rPr>
-        <w:t>in response to climate change</w:t>
+        <w:lastRenderedPageBreak/>
+        <w:t>Most p</w:t>
+      </w:r>
+      <w:r>
+        <w:rPr>
+          <w:rFonts w:ascii="Times New Roman" w:hAnsi="Times New Roman" w:cs="Times New Roman"/>
+        </w:rPr>
+        <w:t>revious work on intra-annual (or seasonal) community patterns ha</w:t>
+      </w:r>
+      <w:r>
+        <w:rPr>
+          <w:rFonts w:ascii="Times New Roman" w:hAnsi="Times New Roman" w:cs="Times New Roman"/>
+        </w:rPr>
+        <w:t>s</w:t>
+      </w:r>
+      <w:r>
+        <w:rPr>
+          <w:rFonts w:ascii="Times New Roman" w:hAnsi="Times New Roman" w:cs="Times New Roman"/>
+        </w:rPr>
+        <w:t xml:space="preserve"> </w:t>
+      </w:r>
+      <w:r>
+        <w:rPr>
+          <w:rFonts w:ascii="Times New Roman" w:hAnsi="Times New Roman" w:cs="Times New Roman"/>
+        </w:rPr>
+        <w:t xml:space="preserve">taken </w:t>
+      </w:r>
+      <w:r>
+        <w:rPr>
+          <w:rFonts w:ascii="Times New Roman" w:hAnsi="Times New Roman" w:cs="Times New Roman"/>
+        </w:rPr>
+        <w:t>a snapshot approach</w:t>
+      </w:r>
+      <w:r>
+        <w:rPr>
+          <w:rFonts w:ascii="Times New Roman" w:hAnsi="Times New Roman" w:cs="Times New Roman"/>
+        </w:rPr>
+        <w:t xml:space="preserve">, which compares </w:t>
+      </w:r>
+      <w:r>
+        <w:rPr>
+          <w:rFonts w:ascii="Times New Roman" w:hAnsi="Times New Roman" w:cs="Times New Roman"/>
+        </w:rPr>
+        <w:t>species richness</w:t>
+      </w:r>
+      <w:r>
+        <w:rPr>
+          <w:rFonts w:ascii="Times New Roman" w:hAnsi="Times New Roman" w:cs="Times New Roman"/>
+        </w:rPr>
+        <w:t>,</w:t>
+      </w:r>
+      <w:r>
+        <w:rPr>
+          <w:rFonts w:ascii="Times New Roman" w:hAnsi="Times New Roman" w:cs="Times New Roman"/>
+        </w:rPr>
+        <w:t xml:space="preserve"> diversity</w:t>
+      </w:r>
+      <w:r>
+        <w:rPr>
+          <w:rFonts w:ascii="Times New Roman" w:hAnsi="Times New Roman" w:cs="Times New Roman"/>
+        </w:rPr>
+        <w:t>, or interaction networks</w:t>
+      </w:r>
+      <w:r>
+        <w:rPr>
+          <w:rFonts w:ascii="Times New Roman" w:hAnsi="Times New Roman" w:cs="Times New Roman"/>
+        </w:rPr>
+        <w:t xml:space="preserve"> </w:t>
+      </w:r>
+      <w:r>
+        <w:rPr>
+          <w:rFonts w:ascii="Times New Roman" w:hAnsi="Times New Roman" w:cs="Times New Roman"/>
+        </w:rPr>
+        <w:t xml:space="preserve">at discrete </w:t>
+      </w:r>
+      <w:r>
+        <w:rPr>
+          <w:rFonts w:ascii="Times New Roman" w:hAnsi="Times New Roman" w:cs="Times New Roman"/>
+        </w:rPr>
+        <w:t>time</w:t>
+      </w:r>
+      <w:r>
+        <w:rPr>
+          <w:rFonts w:ascii="Times New Roman" w:hAnsi="Times New Roman" w:cs="Times New Roman"/>
+        </w:rPr>
+        <w:t xml:space="preserve"> points</w:t>
       </w:r>
       <w:r>
         <w:rPr>
@@ -973,115 +591,175 @@
         <w:rPr>
           <w:rFonts w:ascii="Times New Roman" w:hAnsi="Times New Roman" w:cs="Times New Roman"/>
         </w:rPr>
-        <w:t xml:space="preserve">These </w:t>
-      </w:r>
-      <w:r>
-        <w:rPr>
-          <w:rFonts w:ascii="Times New Roman" w:hAnsi="Times New Roman" w:cs="Times New Roman"/>
-        </w:rPr>
-        <w:t xml:space="preserve">individual </w:t>
-      </w:r>
-      <w:r>
-        <w:rPr>
-          <w:rFonts w:ascii="Times New Roman" w:hAnsi="Times New Roman" w:cs="Times New Roman"/>
-        </w:rPr>
-        <w:t xml:space="preserve">differences can scale up to alter the entire temporal organization of communities. </w:t>
-      </w:r>
-      <w:r>
-        <w:rPr>
-          <w:rFonts w:ascii="Times New Roman" w:hAnsi="Times New Roman" w:cs="Times New Roman"/>
-        </w:rPr>
-        <w:t xml:space="preserve">For instance, </w:t>
-      </w:r>
-      <w:r>
-        <w:rPr>
-          <w:rFonts w:ascii="Times New Roman" w:hAnsi="Times New Roman" w:cs="Times New Roman"/>
-        </w:rPr>
-        <w:t xml:space="preserve">by altering the relative timing and/or spacing between phenologies, </w:t>
-      </w:r>
-      <w:r>
-        <w:rPr>
-          <w:rFonts w:ascii="Times New Roman" w:hAnsi="Times New Roman" w:cs="Times New Roman"/>
-        </w:rPr>
-        <w:t xml:space="preserve">extreme climate events </w:t>
-      </w:r>
-      <w:r>
-        <w:rPr>
-          <w:rFonts w:ascii="Times New Roman" w:hAnsi="Times New Roman" w:cs="Times New Roman"/>
-        </w:rPr>
-        <w:t xml:space="preserve">could </w:t>
-      </w:r>
-      <w:r>
-        <w:rPr>
-          <w:rFonts w:ascii="Times New Roman" w:hAnsi="Times New Roman" w:cs="Times New Roman"/>
-        </w:rPr>
-        <w:t xml:space="preserve">alter the timing, duration, and even </w:t>
-      </w:r>
-      <w:r>
-        <w:rPr>
-          <w:rFonts w:ascii="Times New Roman" w:hAnsi="Times New Roman" w:cs="Times New Roman"/>
-        </w:rPr>
-        <w:t xml:space="preserve">the </w:t>
-      </w:r>
-      <w:r>
-        <w:rPr>
-          <w:rFonts w:ascii="Times New Roman" w:hAnsi="Times New Roman" w:cs="Times New Roman"/>
-        </w:rPr>
-        <w:t xml:space="preserve">diversity of community states and their sequence. These </w:t>
-      </w:r>
-      <w:r>
-        <w:rPr>
-          <w:rFonts w:ascii="Times New Roman" w:hAnsi="Times New Roman" w:cs="Times New Roman"/>
-        </w:rPr>
-        <w:t xml:space="preserve">effects </w:t>
-      </w:r>
-      <w:r>
-        <w:rPr>
-          <w:rFonts w:ascii="Times New Roman" w:hAnsi="Times New Roman" w:cs="Times New Roman"/>
-        </w:rPr>
-        <w:t xml:space="preserve">could be </w:t>
-      </w:r>
-      <w:r>
-        <w:rPr>
-          <w:rFonts w:ascii="Times New Roman" w:hAnsi="Times New Roman" w:cs="Times New Roman"/>
-        </w:rPr>
-        <w:t>correlated</w:t>
-      </w:r>
-      <w:r>
-        <w:rPr>
-          <w:rFonts w:ascii="Times New Roman" w:hAnsi="Times New Roman" w:cs="Times New Roman"/>
-        </w:rPr>
-        <w:t xml:space="preserve"> across local communities if species experience the same climatic conditions, or </w:t>
-      </w:r>
-      <w:r>
-        <w:rPr>
-          <w:rFonts w:ascii="Times New Roman" w:hAnsi="Times New Roman" w:cs="Times New Roman"/>
-        </w:rPr>
-        <w:t xml:space="preserve">they </w:t>
-      </w:r>
-      <w:r>
-        <w:rPr>
-          <w:rFonts w:ascii="Times New Roman" w:hAnsi="Times New Roman" w:cs="Times New Roman"/>
-        </w:rPr>
-        <w:t xml:space="preserve">could be </w:t>
-      </w:r>
-      <w:r>
-        <w:rPr>
-          <w:rFonts w:ascii="Times New Roman" w:hAnsi="Times New Roman" w:cs="Times New Roman"/>
-        </w:rPr>
-        <w:t xml:space="preserve">modulated by local </w:t>
-      </w:r>
-      <w:r>
-        <w:rPr>
-          <w:rFonts w:ascii="Times New Roman" w:hAnsi="Times New Roman" w:cs="Times New Roman"/>
-        </w:rPr>
-        <w:t xml:space="preserve">biotic and abiotic </w:t>
-      </w:r>
-      <w:r>
-        <w:rPr>
-          <w:rFonts w:ascii="Times New Roman" w:hAnsi="Times New Roman" w:cs="Times New Roman"/>
-        </w:rPr>
-        <w:t>conditions</w:t>
+        <w:t>T</w:t>
+      </w:r>
+      <w:r>
+        <w:rPr>
+          <w:rFonts w:ascii="Times New Roman" w:hAnsi="Times New Roman" w:cs="Times New Roman"/>
+        </w:rPr>
+        <w:t xml:space="preserve">hese studies </w:t>
+      </w:r>
+      <w:r>
+        <w:rPr>
+          <w:rFonts w:ascii="Times New Roman" w:hAnsi="Times New Roman" w:cs="Times New Roman"/>
+        </w:rPr>
+        <w:t xml:space="preserve">have </w:t>
+      </w:r>
+      <w:r>
+        <w:rPr>
+          <w:rFonts w:ascii="Times New Roman" w:hAnsi="Times New Roman" w:cs="Times New Roman"/>
+        </w:rPr>
+        <w:t xml:space="preserve">highlighted the dynamic nature of natural communities and </w:t>
+      </w:r>
+      <w:r>
+        <w:rPr>
+          <w:rFonts w:ascii="Times New Roman" w:hAnsi="Times New Roman" w:cs="Times New Roman"/>
+        </w:rPr>
+        <w:t xml:space="preserve">revealed </w:t>
+      </w:r>
+      <w:r>
+        <w:rPr>
+          <w:rFonts w:ascii="Times New Roman" w:hAnsi="Times New Roman" w:cs="Times New Roman"/>
+        </w:rPr>
+        <w:t xml:space="preserve">broad seasonal </w:t>
+      </w:r>
+      <w:r>
+        <w:rPr>
+          <w:rFonts w:ascii="Times New Roman" w:hAnsi="Times New Roman" w:cs="Times New Roman"/>
+        </w:rPr>
+        <w:t>patterns</w:t>
+      </w:r>
+      <w:r>
+        <w:rPr>
+          <w:rFonts w:ascii="Times New Roman" w:hAnsi="Times New Roman" w:cs="Times New Roman"/>
+        </w:rPr>
+        <w:t>, such as</w:t>
+      </w:r>
+      <w:r>
+        <w:rPr>
+          <w:rFonts w:ascii="Times New Roman" w:hAnsi="Times New Roman" w:cs="Times New Roman"/>
+        </w:rPr>
+        <w:t xml:space="preserve"> seasonal richness (diversity) relationships</w:t>
+      </w:r>
+      <w:r>
+        <w:rPr>
+          <w:rFonts w:ascii="Times New Roman" w:hAnsi="Times New Roman" w:cs="Times New Roman"/>
+        </w:rPr>
+        <w:t>,</w:t>
+      </w:r>
+      <w:r>
+        <w:rPr>
+          <w:rFonts w:ascii="Times New Roman" w:hAnsi="Times New Roman" w:cs="Times New Roman"/>
+        </w:rPr>
+        <w:t xml:space="preserve"> </w:t>
+      </w:r>
+      <w:r>
+        <w:rPr>
+          <w:rFonts w:ascii="Times New Roman" w:hAnsi="Times New Roman" w:cs="Times New Roman"/>
+        </w:rPr>
+        <w:t xml:space="preserve">and </w:t>
+      </w:r>
+      <w:r>
+        <w:rPr>
+          <w:rFonts w:ascii="Times New Roman" w:hAnsi="Times New Roman" w:cs="Times New Roman"/>
+        </w:rPr>
+        <w:t xml:space="preserve">how they differ </w:t>
+      </w:r>
+      <w:r>
+        <w:rPr>
+          <w:rFonts w:ascii="Times New Roman" w:hAnsi="Times New Roman" w:cs="Times New Roman"/>
+        </w:rPr>
+        <w:t>across regions</w:t>
+      </w:r>
+      <w:r>
+        <w:rPr>
+          <w:rFonts w:ascii="Times New Roman" w:hAnsi="Times New Roman" w:cs="Times New Roman"/>
+        </w:rPr>
+        <w:t xml:space="preserve">. </w:t>
+      </w:r>
+      <w:r>
+        <w:rPr>
+          <w:rFonts w:ascii="Times New Roman" w:hAnsi="Times New Roman" w:cs="Times New Roman"/>
+        </w:rPr>
+        <w:t xml:space="preserve">However, this </w:t>
+      </w:r>
+      <w:r>
+        <w:rPr>
+          <w:rFonts w:ascii="Times New Roman" w:hAnsi="Times New Roman" w:cs="Times New Roman"/>
+        </w:rPr>
+        <w:t xml:space="preserve">framework </w:t>
+      </w:r>
+      <w:r>
+        <w:rPr>
+          <w:rFonts w:ascii="Times New Roman" w:hAnsi="Times New Roman" w:cs="Times New Roman"/>
+        </w:rPr>
+        <w:t xml:space="preserve">often </w:t>
+      </w:r>
+      <w:r>
+        <w:rPr>
+          <w:rFonts w:ascii="Times New Roman" w:hAnsi="Times New Roman" w:cs="Times New Roman"/>
+        </w:rPr>
+        <w:t xml:space="preserve">overlooks the deeper </w:t>
+      </w:r>
+      <w:r>
+        <w:rPr>
+          <w:rFonts w:ascii="Times New Roman" w:hAnsi="Times New Roman" w:cs="Times New Roman"/>
+        </w:rPr>
+        <w:t xml:space="preserve">temporal </w:t>
+      </w:r>
+      <w:r>
+        <w:rPr>
+          <w:rFonts w:ascii="Times New Roman" w:hAnsi="Times New Roman" w:cs="Times New Roman"/>
+        </w:rPr>
+        <w:t>organization of communities</w:t>
+      </w:r>
+      <w:r>
+        <w:rPr>
+          <w:rFonts w:ascii="Times New Roman" w:hAnsi="Times New Roman" w:cs="Times New Roman"/>
+        </w:rPr>
+        <w:t xml:space="preserve">, </w:t>
+      </w:r>
+      <w:r>
+        <w:rPr>
+          <w:rFonts w:ascii="Times New Roman" w:hAnsi="Times New Roman" w:cs="Times New Roman"/>
+        </w:rPr>
+        <w:t xml:space="preserve">like </w:t>
+      </w:r>
+      <w:r>
+        <w:rPr>
+          <w:rFonts w:ascii="Times New Roman" w:hAnsi="Times New Roman" w:cs="Times New Roman"/>
+        </w:rPr>
+        <w:t>how long a community state persists</w:t>
+      </w:r>
+      <w:r>
+        <w:rPr>
+          <w:rFonts w:ascii="Times New Roman" w:hAnsi="Times New Roman" w:cs="Times New Roman"/>
+        </w:rPr>
+        <w:t>,</w:t>
+      </w:r>
+      <w:r>
+        <w:rPr>
+          <w:rFonts w:ascii="Times New Roman" w:hAnsi="Times New Roman" w:cs="Times New Roman"/>
+        </w:rPr>
+        <w:t xml:space="preserve"> </w:t>
+      </w:r>
+      <w:r>
+        <w:rPr>
+          <w:rFonts w:ascii="Times New Roman" w:hAnsi="Times New Roman" w:cs="Times New Roman"/>
+        </w:rPr>
+        <w:t>the sequence and timing of transitions</w:t>
+      </w:r>
+      <w:r>
+        <w:rPr>
+          <w:rFonts w:ascii="Times New Roman" w:hAnsi="Times New Roman" w:cs="Times New Roman"/>
+        </w:rPr>
+        <w:t xml:space="preserve"> between them</w:t>
+      </w:r>
+      <w:r>
+        <w:rPr>
+          <w:rFonts w:ascii="Times New Roman" w:hAnsi="Times New Roman" w:cs="Times New Roman"/>
+        </w:rPr>
+        <w:t>, or how predictable these patterns are</w:t>
       </w:r>
       <w:r>
         <w:rPr>
@@ -1094,6 +772,42 @@
           <w:rFonts w:ascii="Times New Roman" w:hAnsi="Times New Roman" w:cs="Times New Roman"/>
         </w:rPr>
         <w:t xml:space="preserve"> </w:t>
+      </w:r>
+      <w:r>
+        <w:rPr>
+          <w:rFonts w:ascii="Times New Roman" w:hAnsi="Times New Roman" w:cs="Times New Roman"/>
+        </w:rPr>
+        <w:t>Consequently</w:t>
+      </w:r>
+      <w:r>
+        <w:rPr>
+          <w:rFonts w:ascii="Times New Roman" w:hAnsi="Times New Roman" w:cs="Times New Roman"/>
+        </w:rPr>
+        <w:t xml:space="preserve">, many fundamental </w:t>
+      </w:r>
+      <w:r>
+        <w:rPr>
+          <w:rFonts w:ascii="Times New Roman" w:hAnsi="Times New Roman" w:cs="Times New Roman"/>
+        </w:rPr>
+        <w:t xml:space="preserve">questions </w:t>
+      </w:r>
+      <w:r>
+        <w:rPr>
+          <w:rFonts w:ascii="Times New Roman" w:hAnsi="Times New Roman" w:cs="Times New Roman"/>
+        </w:rPr>
+        <w:t xml:space="preserve">about the temporal organization of communities </w:t>
+      </w:r>
+      <w:r>
+        <w:rPr>
+          <w:rFonts w:ascii="Times New Roman" w:hAnsi="Times New Roman" w:cs="Times New Roman"/>
+        </w:rPr>
+        <w:t>remain unanswered</w:t>
+      </w:r>
+      <w:r>
+        <w:rPr>
+          <w:rFonts w:ascii="Times New Roman" w:hAnsi="Times New Roman" w:cs="Times New Roman"/>
+        </w:rPr>
+        <w:t xml:space="preserve">. </w:t>
       </w:r>
     </w:p>
     <w:p>
@@ -1120,19 +834,7 @@
         <w:rPr>
           <w:rFonts w:ascii="Times New Roman" w:hAnsi="Times New Roman" w:cs="Times New Roman"/>
         </w:rPr>
-        <w:t xml:space="preserve">these </w:t>
-      </w:r>
-      <w:r>
-        <w:rPr>
-          <w:rFonts w:ascii="Times New Roman" w:hAnsi="Times New Roman" w:cs="Times New Roman"/>
-        </w:rPr>
-        <w:t xml:space="preserve">and related </w:t>
-      </w:r>
-      <w:r>
-        <w:rPr>
-          <w:rFonts w:ascii="Times New Roman" w:hAnsi="Times New Roman" w:cs="Times New Roman"/>
-        </w:rPr>
-        <w:t xml:space="preserve">questions </w:t>
+        <w:t xml:space="preserve">these questions </w:t>
       </w:r>
       <w:r>
         <w:rPr>
@@ -1216,7 +918,13 @@
         <w:rPr>
           <w:rFonts w:ascii="Times New Roman" w:hAnsi="Times New Roman" w:cs="Times New Roman"/>
         </w:rPr>
-        <w:t xml:space="preserve">using a </w:t>
+        <w:t xml:space="preserve">by applying </w:t>
+      </w:r>
+      <w:r>
+        <w:rPr>
+          <w:rFonts w:ascii="Times New Roman" w:hAnsi="Times New Roman" w:cs="Times New Roman"/>
+        </w:rPr>
+        <w:t xml:space="preserve">a </w:t>
       </w:r>
       <w:r>
         <w:rPr>
@@ -1246,7 +954,7 @@
         <w:rPr>
           <w:rFonts w:ascii="Times New Roman" w:hAnsi="Times New Roman" w:cs="Times New Roman"/>
         </w:rPr>
-        <w:t xml:space="preserve">framework applied to </w:t>
+        <w:t xml:space="preserve">framework to </w:t>
       </w:r>
       <w:r>
         <w:rPr>
@@ -1294,43 +1002,37 @@
         <w:rPr>
           <w:rFonts w:ascii="Times New Roman" w:hAnsi="Times New Roman" w:cs="Times New Roman"/>
         </w:rPr>
-        <w:t xml:space="preserve">. </w:t>
-      </w:r>
-      <w:r>
-        <w:rPr>
-          <w:rFonts w:ascii="Times New Roman" w:hAnsi="Times New Roman" w:cs="Times New Roman"/>
-        </w:rPr>
-        <w:t xml:space="preserve">Using </w:t>
-      </w:r>
-      <w:r>
-        <w:rPr>
-          <w:rFonts w:ascii="Times New Roman" w:hAnsi="Times New Roman" w:cs="Times New Roman"/>
-        </w:rPr>
-        <w:t xml:space="preserve">the resulting 192 </w:t>
-      </w:r>
-      <w:r>
-        <w:rPr>
-          <w:rFonts w:ascii="Times New Roman" w:hAnsi="Times New Roman" w:cs="Times New Roman"/>
-        </w:rPr>
-        <w:t xml:space="preserve">transition networks </w:t>
-      </w:r>
-      <w:r>
-        <w:rPr>
-          <w:rFonts w:ascii="Times New Roman" w:hAnsi="Times New Roman" w:cs="Times New Roman"/>
-        </w:rPr>
-        <w:t xml:space="preserve">to characterize intra-annual changes in </w:t>
-      </w:r>
-      <w:r>
-        <w:rPr>
-          <w:rFonts w:ascii="Times New Roman" w:hAnsi="Times New Roman" w:cs="Times New Roman"/>
-        </w:rPr>
-        <w:t xml:space="preserve">community </w:t>
-      </w:r>
-      <w:r>
-        <w:rPr>
-          <w:rFonts w:ascii="Times New Roman" w:hAnsi="Times New Roman" w:cs="Times New Roman"/>
-        </w:rPr>
-        <w:t xml:space="preserve">composition, we ask: </w:t>
+        <w:t xml:space="preserve">. By characterizing </w:t>
+      </w:r>
+      <w:r>
+        <w:rPr>
+          <w:rFonts w:ascii="Times New Roman" w:hAnsi="Times New Roman" w:cs="Times New Roman"/>
+        </w:rPr>
+        <w:t xml:space="preserve">intra-annual changes in </w:t>
+      </w:r>
+      <w:r>
+        <w:rPr>
+          <w:rFonts w:ascii="Times New Roman" w:hAnsi="Times New Roman" w:cs="Times New Roman"/>
+        </w:rPr>
+        <w:t xml:space="preserve">the </w:t>
+      </w:r>
+      <w:r>
+        <w:rPr>
+          <w:rFonts w:ascii="Times New Roman" w:hAnsi="Times New Roman" w:cs="Times New Roman"/>
+        </w:rPr>
+        <w:t>composition</w:t>
+      </w:r>
+      <w:r>
+        <w:rPr>
+          <w:rFonts w:ascii="Times New Roman" w:hAnsi="Times New Roman" w:cs="Times New Roman"/>
+        </w:rPr>
+        <w:t>s of 192 unique annual communities</w:t>
+      </w:r>
+      <w:r>
+        <w:rPr>
+          <w:rFonts w:ascii="Times New Roman" w:hAnsi="Times New Roman" w:cs="Times New Roman"/>
+        </w:rPr>
+        <w:t xml:space="preserve">, we ask: </w:t>
       </w:r>
       <w:r>
         <w:rPr>
@@ -1439,6 +1141,12 @@
           <w:rFonts w:ascii="Times New Roman" w:hAnsi="Times New Roman" w:cs="Times New Roman"/>
         </w:rPr>
         <w:t>extreme events</w:t>
+      </w:r>
+      <w:r>
+        <w:rPr>
+          <w:rFonts w:ascii="Times New Roman" w:hAnsi="Times New Roman" w:cs="Times New Roman"/>
+        </w:rPr>
+        <w:t>,</w:t>
       </w:r>
       <w:r>
         <w:rPr>
@@ -1486,7 +1194,6 @@
           <w:i/>
           <w:iCs/>
         </w:rPr>
-        <w:lastRenderedPageBreak/>
         <w:t>Quantifying temporal community structure</w:t>
       </w:r>
     </w:p>
@@ -1562,14 +1269,23 @@
         <w:rPr>
           <w:rFonts w:ascii="Times New Roman" w:hAnsi="Times New Roman" w:cs="Times New Roman"/>
         </w:rPr>
-        <w:t xml:space="preserve">approach treats each unique combination of species as a node, and links between nodes indicate a change in community structure when species enter or leave a community. Each node and link </w:t>
-      </w:r>
+        <w:t xml:space="preserve">approach treats each unique combination of </w:t>
+      </w:r>
+      <w:r>
+        <w:rPr>
+          <w:rFonts w:ascii="Times New Roman" w:hAnsi="Times New Roman" w:cs="Times New Roman"/>
+        </w:rPr>
+        <w:lastRenderedPageBreak/>
+        <w:t xml:space="preserve">species as a node, and links between nodes indicate a change in community structure when species enter or leave a community. Each node and link </w:t>
+      </w:r>
+      <w:proofErr w:type="gramStart"/>
       <w:r>
         <w:rPr>
           <w:rFonts w:ascii="Times New Roman" w:hAnsi="Times New Roman" w:cs="Times New Roman"/>
         </w:rPr>
         <w:t>has</w:t>
       </w:r>
+      <w:proofErr w:type="gramEnd"/>
       <w:r>
         <w:rPr>
           <w:rFonts w:ascii="Times New Roman" w:hAnsi="Times New Roman" w:cs="Times New Roman"/>
@@ -2313,14 +2029,7 @@
         <w:rPr>
           <w:rFonts w:ascii="Times New Roman" w:hAnsi="Times New Roman" w:cs="Times New Roman"/>
         </w:rPr>
-        <w:t xml:space="preserve">Amphibians exhibit some of the strongest phenological </w:t>
-      </w:r>
-      <w:r>
-        <w:rPr>
-          <w:rFonts w:ascii="Times New Roman" w:hAnsi="Times New Roman" w:cs="Times New Roman"/>
-        </w:rPr>
-        <w:lastRenderedPageBreak/>
-        <w:t xml:space="preserve">responses to climate change </w:t>
+        <w:t xml:space="preserve">Amphibians exhibit some of the strongest phenological responses to climate change </w:t>
       </w:r>
       <w:r>
         <w:rPr>
@@ -2787,7 +2496,14 @@
         <w:rPr>
           <w:rFonts w:ascii="Times New Roman" w:hAnsi="Times New Roman" w:cs="Times New Roman"/>
         </w:rPr>
-        <w:t xml:space="preserve">Here, we </w:t>
+        <w:lastRenderedPageBreak/>
+        <w:t>W</w:t>
+      </w:r>
+      <w:r>
+        <w:rPr>
+          <w:rFonts w:ascii="Times New Roman" w:hAnsi="Times New Roman" w:cs="Times New Roman"/>
+        </w:rPr>
+        <w:t xml:space="preserve">e </w:t>
       </w:r>
       <w:r>
         <w:rPr>
@@ -2847,7 +2563,19 @@
         <w:rPr>
           <w:rFonts w:ascii="Times New Roman" w:hAnsi="Times New Roman" w:cs="Times New Roman"/>
         </w:rPr>
-        <w:t xml:space="preserve">. Details of ponds </w:t>
+        <w:t xml:space="preserve">. Details of </w:t>
+      </w:r>
+      <w:r>
+        <w:rPr>
+          <w:rFonts w:ascii="Times New Roman" w:hAnsi="Times New Roman" w:cs="Times New Roman"/>
+        </w:rPr>
+        <w:t>pond</w:t>
+      </w:r>
+      <w:r>
+        <w:rPr>
+          <w:rFonts w:ascii="Times New Roman" w:hAnsi="Times New Roman" w:cs="Times New Roman"/>
+        </w:rPr>
+        <w:t xml:space="preserve"> </w:t>
       </w:r>
       <w:r>
         <w:rPr>
@@ -2961,55 +2689,19 @@
         <w:rPr>
           <w:rFonts w:ascii="Times New Roman" w:hAnsi="Times New Roman" w:cs="Times New Roman"/>
         </w:rPr>
-        <w:t>We recorded c</w:t>
-      </w:r>
-      <w:r>
-        <w:rPr>
-          <w:rFonts w:ascii="Times New Roman" w:hAnsi="Times New Roman" w:cs="Times New Roman"/>
-        </w:rPr>
-        <w:t xml:space="preserve">alling </w:t>
-      </w:r>
-      <w:r>
-        <w:rPr>
-          <w:rFonts w:ascii="Times New Roman" w:hAnsi="Times New Roman" w:cs="Times New Roman"/>
-        </w:rPr>
-        <w:t xml:space="preserve">each night six times for </w:t>
-      </w:r>
-      <w:r>
-        <w:rPr>
-          <w:rFonts w:ascii="Times New Roman" w:hAnsi="Times New Roman" w:cs="Times New Roman"/>
-        </w:rPr>
-        <w:t xml:space="preserve">a </w:t>
-      </w:r>
-      <w:r>
-        <w:rPr>
-          <w:rFonts w:ascii="Times New Roman" w:hAnsi="Times New Roman" w:cs="Times New Roman"/>
-        </w:rPr>
-        <w:t xml:space="preserve">1-minute period </w:t>
-      </w:r>
-      <w:r>
-        <w:rPr>
-          <w:rFonts w:ascii="Times New Roman" w:hAnsi="Times New Roman" w:cs="Times New Roman"/>
-        </w:rPr>
-        <w:t>during peak calling time (</w:t>
-      </w:r>
-      <w:r>
-        <w:rPr>
-          <w:rFonts w:ascii="Times New Roman" w:hAnsi="Times New Roman" w:cs="Times New Roman"/>
-        </w:rPr>
-        <w:t xml:space="preserve">hourly </w:t>
-      </w:r>
-      <w:r>
-        <w:rPr>
-          <w:rFonts w:ascii="Times New Roman" w:hAnsi="Times New Roman" w:cs="Times New Roman"/>
-        </w:rPr>
-        <w:t xml:space="preserve">from 21:00-3:00) </w:t>
-      </w:r>
-      <w:r>
-        <w:rPr>
-          <w:rFonts w:ascii="Times New Roman" w:hAnsi="Times New Roman" w:cs="Times New Roman"/>
-        </w:rPr>
-        <w:t xml:space="preserve">with </w:t>
+        <w:t xml:space="preserve">We recorded </w:t>
+      </w:r>
+      <w:r>
+        <w:rPr>
+          <w:rFonts w:ascii="Times New Roman" w:hAnsi="Times New Roman" w:cs="Times New Roman"/>
+        </w:rPr>
+        <w:t>calls each night six times for a 1-minute period during peak calling time (hourly from 21:00 to 3:00) using</w:t>
+      </w:r>
+      <w:r>
+        <w:rPr>
+          <w:rFonts w:ascii="Times New Roman" w:hAnsi="Times New Roman" w:cs="Times New Roman"/>
+        </w:rPr>
+        <w:t xml:space="preserve"> </w:t>
       </w:r>
       <w:r>
         <w:rPr>
@@ -3021,7 +2713,25 @@
         <w:rPr>
           <w:rFonts w:ascii="Times New Roman" w:hAnsi="Times New Roman" w:cs="Times New Roman"/>
         </w:rPr>
-        <w:t xml:space="preserve">audio-recorder </w:t>
+        <w:t xml:space="preserve">automated </w:t>
+      </w:r>
+      <w:r>
+        <w:rPr>
+          <w:rFonts w:ascii="Times New Roman" w:hAnsi="Times New Roman" w:cs="Times New Roman"/>
+        </w:rPr>
+        <w:t>audio</w:t>
+      </w:r>
+      <w:r>
+        <w:rPr>
+          <w:rFonts w:ascii="Times New Roman" w:hAnsi="Times New Roman" w:cs="Times New Roman"/>
+        </w:rPr>
+        <w:t xml:space="preserve"> </w:t>
+      </w:r>
+      <w:r>
+        <w:rPr>
+          <w:rFonts w:ascii="Times New Roman" w:hAnsi="Times New Roman" w:cs="Times New Roman"/>
+        </w:rPr>
+        <w:t xml:space="preserve">recorder </w:t>
       </w:r>
       <w:r>
         <w:rPr>
@@ -3438,7 +3148,19 @@
         <w:rPr>
           <w:rFonts w:ascii="Times New Roman" w:hAnsi="Times New Roman" w:cs="Times New Roman"/>
         </w:rPr>
-        <w:t xml:space="preserve">We collected daily weather data from the closest public local weather station situated between both pond clusters (Lufkin, Angelina Co. Airport, Tx, </w:t>
+        <w:t xml:space="preserve">We </w:t>
+      </w:r>
+      <w:r>
+        <w:rPr>
+          <w:rFonts w:ascii="Times New Roman" w:hAnsi="Times New Roman" w:cs="Times New Roman"/>
+        </w:rPr>
+        <w:t xml:space="preserve">obtained </w:t>
+      </w:r>
+      <w:r>
+        <w:rPr>
+          <w:rFonts w:ascii="Times New Roman" w:hAnsi="Times New Roman" w:cs="Times New Roman"/>
+        </w:rPr>
+        <w:t xml:space="preserve">daily weather data from the closest public local weather station situated between both pond clusters (Lufkin, Angelina Co. Airport, Tx, </w:t>
       </w:r>
       <w:r>
         <w:rPr>
@@ -3490,44 +3212,51 @@
         <w:rPr>
           <w:rFonts w:ascii="Times New Roman" w:hAnsi="Times New Roman" w:cs="Times New Roman"/>
         </w:rPr>
-        <w:t xml:space="preserve">) temperature. In addition, </w:t>
+        <w:t xml:space="preserve">) temperature. </w:t>
+      </w:r>
+      <w:commentRangeStart w:id="1"/>
+      <w:r>
+        <w:rPr>
+          <w:rFonts w:ascii="Times New Roman" w:hAnsi="Times New Roman" w:cs="Times New Roman"/>
+        </w:rPr>
+        <w:t xml:space="preserve">In addition, we obtained </w:t>
+      </w:r>
+      <w:r>
+        <w:rPr>
+          <w:rFonts w:ascii="Times New Roman" w:hAnsi="Times New Roman" w:cs="Times New Roman"/>
+        </w:rPr>
+        <w:t xml:space="preserve">daily </w:t>
+      </w:r>
+      <w:r>
+        <w:rPr>
+          <w:rFonts w:ascii="Times New Roman" w:hAnsi="Times New Roman" w:cs="Times New Roman"/>
+        </w:rPr>
+        <w:t>integrated drought severity metrics from the National Integrated Drought Information System (drought.gov)</w:t>
+      </w:r>
+      <w:r>
+        <w:rPr>
+          <w:rFonts w:ascii="Times New Roman" w:hAnsi="Times New Roman" w:cs="Times New Roman"/>
+        </w:rPr>
+        <w:t xml:space="preserve">, which </w:t>
+      </w:r>
+      <w:r>
+        <w:rPr>
+          <w:rFonts w:ascii="Times New Roman" w:hAnsi="Times New Roman" w:cs="Times New Roman"/>
+        </w:rPr>
+        <w:t xml:space="preserve">considers a range of </w:t>
+      </w:r>
+      <w:r>
+        <w:rPr>
+          <w:rFonts w:ascii="Times New Roman" w:hAnsi="Times New Roman" w:cs="Times New Roman"/>
+        </w:rPr>
+        <w:t xml:space="preserve">variables to indicate the amount </w:t>
       </w:r>
       <w:r>
         <w:rPr>
           <w:rFonts w:ascii="Times New Roman" w:hAnsi="Times New Roman" w:cs="Times New Roman"/>
         </w:rPr>
         <w:lastRenderedPageBreak/>
-        <w:t xml:space="preserve">we obtained </w:t>
-      </w:r>
-      <w:r>
-        <w:rPr>
-          <w:rFonts w:ascii="Times New Roman" w:hAnsi="Times New Roman" w:cs="Times New Roman"/>
-        </w:rPr>
-        <w:t xml:space="preserve">daily </w:t>
-      </w:r>
-      <w:r>
-        <w:rPr>
-          <w:rFonts w:ascii="Times New Roman" w:hAnsi="Times New Roman" w:cs="Times New Roman"/>
-        </w:rPr>
-        <w:t>integrated drought severity metrics from the National Integrated Drought Information System (drought.gov)</w:t>
-      </w:r>
-      <w:r>
-        <w:rPr>
-          <w:rFonts w:ascii="Times New Roman" w:hAnsi="Times New Roman" w:cs="Times New Roman"/>
-        </w:rPr>
-        <w:t xml:space="preserve">, which </w:t>
-      </w:r>
-      <w:r>
-        <w:rPr>
-          <w:rFonts w:ascii="Times New Roman" w:hAnsi="Times New Roman" w:cs="Times New Roman"/>
-        </w:rPr>
-        <w:t xml:space="preserve">considers a range of </w:t>
-      </w:r>
-      <w:r>
-        <w:rPr>
-          <w:rFonts w:ascii="Times New Roman" w:hAnsi="Times New Roman" w:cs="Times New Roman"/>
-        </w:rPr>
-        <w:t>variables to indicate the amount of “missing” rain</w:t>
+        <w:t>of “missing” rain</w:t>
       </w:r>
       <w:r>
         <w:rPr>
@@ -3540,6 +3269,13 @@
           <w:rFonts w:ascii="Times New Roman" w:hAnsi="Times New Roman" w:cs="Times New Roman"/>
         </w:rPr>
         <w:t xml:space="preserve">. </w:t>
+      </w:r>
+      <w:commentRangeEnd w:id="1"/>
+      <w:r>
+        <w:rPr>
+          <w:rStyle w:val="CommentReference"/>
+        </w:rPr>
+        <w:commentReference w:id="1"/>
       </w:r>
       <w:r>
         <w:rPr>
@@ -3611,7 +3347,6 @@
     <w:p>
       <w:pPr>
         <w:spacing w:line="480" w:lineRule="auto"/>
-        <w:ind w:firstLine="720"/>
         <w:rPr>
           <w:rFonts w:ascii="Times New Roman" w:hAnsi="Times New Roman" w:cs="Times New Roman"/>
         </w:rPr>
@@ -3620,13 +3355,37 @@
         <w:rPr>
           <w:rFonts w:ascii="Times New Roman" w:hAnsi="Times New Roman" w:cs="Times New Roman"/>
         </w:rPr>
-        <w:t xml:space="preserve">To align with our annual community structure analysis, we </w:t>
-      </w:r>
-      <w:r>
-        <w:rPr>
-          <w:rFonts w:ascii="Times New Roman" w:hAnsi="Times New Roman" w:cs="Times New Roman"/>
-        </w:rPr>
-        <w:t xml:space="preserve">binned the daily weather data into annual cycles </w:t>
+        <w:t xml:space="preserve">The </w:t>
+      </w:r>
+      <w:r>
+        <w:rPr>
+          <w:rFonts w:ascii="Times New Roman" w:hAnsi="Times New Roman" w:cs="Times New Roman"/>
+        </w:rPr>
+        <w:t xml:space="preserve">daily weather </w:t>
+      </w:r>
+      <w:r>
+        <w:rPr>
+          <w:rFonts w:ascii="Times New Roman" w:hAnsi="Times New Roman" w:cs="Times New Roman"/>
+        </w:rPr>
+        <w:t xml:space="preserve">was then binned into </w:t>
+      </w:r>
+      <w:r>
+        <w:rPr>
+          <w:rFonts w:ascii="Times New Roman" w:hAnsi="Times New Roman" w:cs="Times New Roman"/>
+        </w:rPr>
+        <w:t xml:space="preserve">annual </w:t>
+      </w:r>
+      <w:r>
+        <w:rPr>
+          <w:rFonts w:ascii="Times New Roman" w:hAnsi="Times New Roman" w:cs="Times New Roman"/>
+        </w:rPr>
+        <w:t xml:space="preserve">reproductive </w:t>
+      </w:r>
+      <w:r>
+        <w:rPr>
+          <w:rFonts w:ascii="Times New Roman" w:hAnsi="Times New Roman" w:cs="Times New Roman"/>
+        </w:rPr>
+        <w:t xml:space="preserve">cycles </w:t>
       </w:r>
       <w:r>
         <w:rPr>
@@ -3766,7 +3525,13 @@
         <w:rPr>
           <w:rFonts w:ascii="Times New Roman" w:hAnsi="Times New Roman" w:cs="Times New Roman"/>
         </w:rPr>
-        <w:t>based on the number of days between rainfall events)</w:t>
+        <w:t xml:space="preserve">captures variation in </w:t>
+      </w:r>
+      <w:r>
+        <w:rPr>
+          <w:rFonts w:ascii="Times New Roman" w:hAnsi="Times New Roman" w:cs="Times New Roman"/>
+        </w:rPr>
+        <w:t>the number of days between rainfall events)</w:t>
       </w:r>
       <w:r>
         <w:rPr>
@@ -3940,19 +3705,71 @@
         <w:rPr>
           <w:rFonts w:ascii="Times New Roman" w:hAnsi="Times New Roman" w:cs="Times New Roman"/>
         </w:rPr>
-        <w:t xml:space="preserve">based on either temperature or </w:t>
-      </w:r>
-      <w:r>
-        <w:rPr>
-          <w:rFonts w:ascii="Times New Roman" w:hAnsi="Times New Roman" w:cs="Times New Roman"/>
-        </w:rPr>
-        <w:t>average daily precipitation</w:t>
-      </w:r>
-      <w:r>
-        <w:rPr>
-          <w:rFonts w:ascii="Times New Roman" w:hAnsi="Times New Roman" w:cs="Times New Roman"/>
-        </w:rPr>
-        <w:t xml:space="preserve">. </w:t>
+        <w:t xml:space="preserve">based on </w:t>
+      </w:r>
+      <w:r>
+        <w:rPr>
+          <w:rFonts w:ascii="Times New Roman" w:hAnsi="Times New Roman" w:cs="Times New Roman"/>
+        </w:rPr>
+        <w:t xml:space="preserve">whether they </w:t>
+      </w:r>
+      <w:r>
+        <w:rPr>
+          <w:rFonts w:ascii="Times New Roman" w:hAnsi="Times New Roman" w:cs="Times New Roman"/>
+        </w:rPr>
+        <w:t xml:space="preserve">fell outside of </w:t>
+      </w:r>
+      <w:r>
+        <w:rPr>
+          <w:rFonts w:ascii="Times New Roman" w:hAnsi="Times New Roman" w:cs="Times New Roman"/>
+        </w:rPr>
+        <w:t>±</w:t>
+      </w:r>
+      <w:r>
+        <w:rPr>
+          <w:rFonts w:ascii="Times New Roman" w:hAnsi="Times New Roman" w:cs="Times New Roman"/>
+        </w:rPr>
+        <w:t xml:space="preserve">1SD of the mean for a given metric. This </w:t>
+      </w:r>
+      <w:r>
+        <w:rPr>
+          <w:rFonts w:ascii="Times New Roman" w:hAnsi="Times New Roman" w:cs="Times New Roman"/>
+        </w:rPr>
+        <w:t>includes</w:t>
+      </w:r>
+      <w:r>
+        <w:rPr>
+          <w:rFonts w:ascii="Times New Roman" w:hAnsi="Times New Roman" w:cs="Times New Roman"/>
+        </w:rPr>
+        <w:t xml:space="preserve"> extreme hot years (&gt;1SD above average </w:t>
+      </w:r>
+      <w:proofErr w:type="spellStart"/>
+      <w:r>
+        <w:rPr>
+          <w:rFonts w:ascii="Times New Roman" w:hAnsi="Times New Roman" w:cs="Times New Roman"/>
+        </w:rPr>
+        <w:t>meanTmax</w:t>
+      </w:r>
+      <w:proofErr w:type="spellEnd"/>
+      <w:r>
+        <w:rPr>
+          <w:rFonts w:ascii="Times New Roman" w:hAnsi="Times New Roman" w:cs="Times New Roman"/>
+        </w:rPr>
+        <w:t xml:space="preserve"> or Day100), and extreme dry years (&gt;1SD below average </w:t>
+      </w:r>
+      <w:proofErr w:type="spellStart"/>
+      <w:r>
+        <w:rPr>
+          <w:rFonts w:ascii="Times New Roman" w:hAnsi="Times New Roman" w:cs="Times New Roman"/>
+        </w:rPr>
+        <w:t>meanPrec</w:t>
+      </w:r>
+      <w:proofErr w:type="spellEnd"/>
+      <w:r>
+        <w:rPr>
+          <w:rFonts w:ascii="Times New Roman" w:hAnsi="Times New Roman" w:cs="Times New Roman"/>
+        </w:rPr>
+        <w:t xml:space="preserve">).  </w:t>
       </w:r>
     </w:p>
     <w:p>
@@ -3960,60 +3777,997 @@
         <w:spacing w:line="480" w:lineRule="auto"/>
         <w:rPr>
           <w:rFonts w:ascii="Times New Roman" w:hAnsi="Times New Roman" w:cs="Times New Roman"/>
-          <w:i/>
-          <w:iCs/>
+          <w:b/>
+          <w:bCs/>
         </w:rPr>
       </w:pPr>
       <w:r>
         <w:rPr>
           <w:rFonts w:ascii="Times New Roman" w:hAnsi="Times New Roman" w:cs="Times New Roman"/>
-          <w:i/>
-          <w:iCs/>
-        </w:rPr>
-        <w:t>Data analysis</w:t>
+          <w:b/>
+          <w:bCs/>
+        </w:rPr>
+        <w:t>Table 1: Metrics to quantify different aspects of the temporal structure of communities.</w:t>
       </w:r>
     </w:p>
+    <w:tbl>
+      <w:tblPr>
+        <w:tblStyle w:val="TableGrid"/>
+        <w:tblW w:w="0" w:type="auto"/>
+        <w:tblLook w:val="04A0" w:firstRow="1" w:lastRow="0" w:firstColumn="1" w:lastColumn="0" w:noHBand="0" w:noVBand="1"/>
+      </w:tblPr>
+      <w:tblGrid>
+        <w:gridCol w:w="3116"/>
+        <w:gridCol w:w="3117"/>
+        <w:gridCol w:w="3117"/>
+      </w:tblGrid>
+      <w:tr>
+        <w:tc>
+          <w:tcPr>
+            <w:tcW w:w="3116" w:type="dxa"/>
+          </w:tcPr>
+          <w:p>
+            <w:pPr>
+              <w:spacing w:line="480" w:lineRule="auto"/>
+              <w:rPr>
+                <w:rFonts w:ascii="Times New Roman" w:hAnsi="Times New Roman" w:cs="Times New Roman"/>
+                <w:b/>
+                <w:bCs/>
+              </w:rPr>
+            </w:pPr>
+            <w:r>
+              <w:rPr>
+                <w:rFonts w:ascii="Times New Roman" w:hAnsi="Times New Roman" w:cs="Times New Roman"/>
+                <w:b/>
+                <w:bCs/>
+              </w:rPr>
+              <w:t>Metric</w:t>
+            </w:r>
+          </w:p>
+        </w:tc>
+        <w:tc>
+          <w:tcPr>
+            <w:tcW w:w="3117" w:type="dxa"/>
+          </w:tcPr>
+          <w:p>
+            <w:pPr>
+              <w:spacing w:line="480" w:lineRule="auto"/>
+              <w:rPr>
+                <w:rFonts w:ascii="Times New Roman" w:hAnsi="Times New Roman" w:cs="Times New Roman"/>
+                <w:b/>
+                <w:bCs/>
+              </w:rPr>
+            </w:pPr>
+            <w:r>
+              <w:rPr>
+                <w:rFonts w:ascii="Times New Roman" w:hAnsi="Times New Roman" w:cs="Times New Roman"/>
+                <w:b/>
+                <w:bCs/>
+              </w:rPr>
+              <w:t>Community attribute</w:t>
+            </w:r>
+          </w:p>
+        </w:tc>
+        <w:tc>
+          <w:tcPr>
+            <w:tcW w:w="3117" w:type="dxa"/>
+          </w:tcPr>
+          <w:p>
+            <w:pPr>
+              <w:spacing w:line="480" w:lineRule="auto"/>
+              <w:rPr>
+                <w:rFonts w:ascii="Times New Roman" w:hAnsi="Times New Roman" w:cs="Times New Roman"/>
+              </w:rPr>
+            </w:pPr>
+          </w:p>
+        </w:tc>
+      </w:tr>
+      <w:tr>
+        <w:tc>
+          <w:tcPr>
+            <w:tcW w:w="3116" w:type="dxa"/>
+          </w:tcPr>
+          <w:p>
+            <w:pPr>
+              <w:spacing w:line="480" w:lineRule="auto"/>
+              <w:rPr>
+                <w:rFonts w:ascii="Times New Roman" w:hAnsi="Times New Roman" w:cs="Times New Roman"/>
+              </w:rPr>
+            </w:pPr>
+            <w:r>
+              <w:rPr>
+                <w:rFonts w:ascii="Times New Roman" w:hAnsi="Times New Roman" w:cs="Times New Roman"/>
+              </w:rPr>
+              <w:t>No. Species</w:t>
+            </w:r>
+          </w:p>
+        </w:tc>
+        <w:tc>
+          <w:tcPr>
+            <w:tcW w:w="3117" w:type="dxa"/>
+          </w:tcPr>
+          <w:p>
+            <w:pPr>
+              <w:spacing w:line="480" w:lineRule="auto"/>
+              <w:rPr>
+                <w:rFonts w:ascii="Times New Roman" w:hAnsi="Times New Roman" w:cs="Times New Roman"/>
+              </w:rPr>
+            </w:pPr>
+          </w:p>
+        </w:tc>
+        <w:tc>
+          <w:tcPr>
+            <w:tcW w:w="3117" w:type="dxa"/>
+          </w:tcPr>
+          <w:p>
+            <w:pPr>
+              <w:spacing w:line="480" w:lineRule="auto"/>
+              <w:rPr>
+                <w:rFonts w:ascii="Times New Roman" w:hAnsi="Times New Roman" w:cs="Times New Roman"/>
+              </w:rPr>
+            </w:pPr>
+            <w:r>
+              <w:rPr>
+                <w:rFonts w:ascii="Times New Roman" w:hAnsi="Times New Roman" w:cs="Times New Roman"/>
+              </w:rPr>
+              <w:t xml:space="preserve">No. species detected </w:t>
+            </w:r>
+            <w:proofErr w:type="gramStart"/>
+            <w:r>
+              <w:rPr>
+                <w:rFonts w:ascii="Times New Roman" w:hAnsi="Times New Roman" w:cs="Times New Roman"/>
+              </w:rPr>
+              <w:t>in a given year</w:t>
+            </w:r>
+            <w:proofErr w:type="gramEnd"/>
+          </w:p>
+        </w:tc>
+      </w:tr>
+      <w:tr>
+        <w:tc>
+          <w:tcPr>
+            <w:tcW w:w="3116" w:type="dxa"/>
+          </w:tcPr>
+          <w:p>
+            <w:pPr>
+              <w:spacing w:line="480" w:lineRule="auto"/>
+              <w:rPr>
+                <w:rFonts w:ascii="Times New Roman" w:hAnsi="Times New Roman" w:cs="Times New Roman"/>
+              </w:rPr>
+            </w:pPr>
+            <w:r>
+              <w:rPr>
+                <w:rFonts w:ascii="Times New Roman" w:hAnsi="Times New Roman" w:cs="Times New Roman"/>
+              </w:rPr>
+              <w:t>No. Unique nodes</w:t>
+            </w:r>
+          </w:p>
+        </w:tc>
+        <w:tc>
+          <w:tcPr>
+            <w:tcW w:w="3117" w:type="dxa"/>
+          </w:tcPr>
+          <w:p>
+            <w:pPr>
+              <w:spacing w:line="480" w:lineRule="auto"/>
+              <w:rPr>
+                <w:rFonts w:ascii="Times New Roman" w:hAnsi="Times New Roman" w:cs="Times New Roman"/>
+              </w:rPr>
+            </w:pPr>
+          </w:p>
+        </w:tc>
+        <w:tc>
+          <w:tcPr>
+            <w:tcW w:w="3117" w:type="dxa"/>
+          </w:tcPr>
+          <w:p>
+            <w:pPr>
+              <w:spacing w:line="480" w:lineRule="auto"/>
+              <w:rPr>
+                <w:rFonts w:ascii="Times New Roman" w:hAnsi="Times New Roman" w:cs="Times New Roman"/>
+              </w:rPr>
+            </w:pPr>
+            <w:r>
+              <w:rPr>
+                <w:rFonts w:ascii="Times New Roman" w:hAnsi="Times New Roman" w:cs="Times New Roman"/>
+              </w:rPr>
+              <w:t>Network size</w:t>
+            </w:r>
+          </w:p>
+        </w:tc>
+      </w:tr>
+      <w:tr>
+        <w:tc>
+          <w:tcPr>
+            <w:tcW w:w="3116" w:type="dxa"/>
+          </w:tcPr>
+          <w:p>
+            <w:pPr>
+              <w:spacing w:line="480" w:lineRule="auto"/>
+              <w:rPr>
+                <w:rFonts w:ascii="Times New Roman" w:hAnsi="Times New Roman" w:cs="Times New Roman"/>
+              </w:rPr>
+            </w:pPr>
+            <w:r>
+              <w:rPr>
+                <w:rFonts w:ascii="Times New Roman" w:hAnsi="Times New Roman" w:cs="Times New Roman"/>
+              </w:rPr>
+              <w:t>Node duration</w:t>
+            </w:r>
+          </w:p>
+        </w:tc>
+        <w:tc>
+          <w:tcPr>
+            <w:tcW w:w="3117" w:type="dxa"/>
+          </w:tcPr>
+          <w:p>
+            <w:pPr>
+              <w:spacing w:line="480" w:lineRule="auto"/>
+              <w:rPr>
+                <w:rFonts w:ascii="Times New Roman" w:hAnsi="Times New Roman" w:cs="Times New Roman"/>
+              </w:rPr>
+            </w:pPr>
+            <w:r>
+              <w:rPr>
+                <w:rFonts w:ascii="Times New Roman" w:hAnsi="Times New Roman" w:cs="Times New Roman"/>
+              </w:rPr>
+              <w:t>Time</w:t>
+            </w:r>
+            <w:r>
+              <w:rPr>
+                <w:rFonts w:ascii="Times New Roman" w:hAnsi="Times New Roman" w:cs="Times New Roman"/>
+              </w:rPr>
+              <w:t>- duration</w:t>
+            </w:r>
+          </w:p>
+        </w:tc>
+        <w:tc>
+          <w:tcPr>
+            <w:tcW w:w="3117" w:type="dxa"/>
+          </w:tcPr>
+          <w:p>
+            <w:pPr>
+              <w:spacing w:line="480" w:lineRule="auto"/>
+              <w:rPr>
+                <w:rFonts w:ascii="Times New Roman" w:hAnsi="Times New Roman" w:cs="Times New Roman"/>
+              </w:rPr>
+            </w:pPr>
+            <w:r>
+              <w:rPr>
+                <w:rFonts w:ascii="Times New Roman" w:hAnsi="Times New Roman" w:cs="Times New Roman"/>
+              </w:rPr>
+              <w:t>Average duration of nodes</w:t>
+            </w:r>
+          </w:p>
+        </w:tc>
+      </w:tr>
+      <w:tr>
+        <w:tc>
+          <w:tcPr>
+            <w:tcW w:w="3116" w:type="dxa"/>
+          </w:tcPr>
+          <w:p>
+            <w:pPr>
+              <w:spacing w:line="480" w:lineRule="auto"/>
+              <w:rPr>
+                <w:rFonts w:ascii="Times New Roman" w:hAnsi="Times New Roman" w:cs="Times New Roman"/>
+              </w:rPr>
+            </w:pPr>
+            <w:r>
+              <w:rPr>
+                <w:rFonts w:ascii="Times New Roman" w:hAnsi="Times New Roman" w:cs="Times New Roman"/>
+              </w:rPr>
+              <w:t>Skewness of node duration</w:t>
+            </w:r>
+          </w:p>
+        </w:tc>
+        <w:tc>
+          <w:tcPr>
+            <w:tcW w:w="3117" w:type="dxa"/>
+          </w:tcPr>
+          <w:p>
+            <w:pPr>
+              <w:spacing w:line="480" w:lineRule="auto"/>
+              <w:rPr>
+                <w:rFonts w:ascii="Times New Roman" w:hAnsi="Times New Roman" w:cs="Times New Roman"/>
+              </w:rPr>
+            </w:pPr>
+            <w:r>
+              <w:rPr>
+                <w:rFonts w:ascii="Times New Roman" w:hAnsi="Times New Roman" w:cs="Times New Roman"/>
+              </w:rPr>
+              <w:t>Time</w:t>
+            </w:r>
+            <w:r>
+              <w:rPr>
+                <w:rFonts w:ascii="Times New Roman" w:hAnsi="Times New Roman" w:cs="Times New Roman"/>
+              </w:rPr>
+              <w:t xml:space="preserve"> -duration</w:t>
+            </w:r>
+          </w:p>
+        </w:tc>
+        <w:tc>
+          <w:tcPr>
+            <w:tcW w:w="3117" w:type="dxa"/>
+          </w:tcPr>
+          <w:p>
+            <w:pPr>
+              <w:spacing w:line="480" w:lineRule="auto"/>
+              <w:rPr>
+                <w:rFonts w:ascii="Times New Roman" w:hAnsi="Times New Roman" w:cs="Times New Roman"/>
+              </w:rPr>
+            </w:pPr>
+            <w:r>
+              <w:rPr>
+                <w:rFonts w:ascii="Times New Roman" w:hAnsi="Times New Roman" w:cs="Times New Roman"/>
+              </w:rPr>
+              <w:t xml:space="preserve">Distribution of variation in duration of nodes (should be </w:t>
+            </w:r>
+            <w:r>
+              <w:rPr>
+                <w:rFonts w:ascii="Times New Roman" w:hAnsi="Times New Roman" w:cs="Times New Roman"/>
+              </w:rPr>
+              <w:lastRenderedPageBreak/>
+              <w:t>on node averages or across all nodes?)</w:t>
+            </w:r>
+          </w:p>
+        </w:tc>
+      </w:tr>
+      <w:tr>
+        <w:tc>
+          <w:tcPr>
+            <w:tcW w:w="3116" w:type="dxa"/>
+          </w:tcPr>
+          <w:p>
+            <w:pPr>
+              <w:spacing w:line="480" w:lineRule="auto"/>
+              <w:rPr>
+                <w:rFonts w:ascii="Times New Roman" w:hAnsi="Times New Roman" w:cs="Times New Roman"/>
+              </w:rPr>
+            </w:pPr>
+            <w:r>
+              <w:rPr>
+                <w:rFonts w:ascii="Times New Roman" w:hAnsi="Times New Roman" w:cs="Times New Roman"/>
+              </w:rPr>
+              <w:lastRenderedPageBreak/>
+              <w:t>No. Unique edges</w:t>
+            </w:r>
+          </w:p>
+        </w:tc>
+        <w:tc>
+          <w:tcPr>
+            <w:tcW w:w="3117" w:type="dxa"/>
+          </w:tcPr>
+          <w:p>
+            <w:pPr>
+              <w:spacing w:line="480" w:lineRule="auto"/>
+              <w:rPr>
+                <w:rFonts w:ascii="Times New Roman" w:hAnsi="Times New Roman" w:cs="Times New Roman"/>
+              </w:rPr>
+            </w:pPr>
+            <w:r>
+              <w:rPr>
+                <w:rFonts w:ascii="Times New Roman" w:hAnsi="Times New Roman" w:cs="Times New Roman"/>
+              </w:rPr>
+              <w:t>(maybe same as connectance?)</w:t>
+            </w:r>
+          </w:p>
+        </w:tc>
+        <w:tc>
+          <w:tcPr>
+            <w:tcW w:w="3117" w:type="dxa"/>
+          </w:tcPr>
+          <w:p>
+            <w:pPr>
+              <w:spacing w:line="480" w:lineRule="auto"/>
+              <w:rPr>
+                <w:rFonts w:ascii="Times New Roman" w:hAnsi="Times New Roman" w:cs="Times New Roman"/>
+              </w:rPr>
+            </w:pPr>
+          </w:p>
+        </w:tc>
+      </w:tr>
+      <w:tr>
+        <w:tc>
+          <w:tcPr>
+            <w:tcW w:w="3116" w:type="dxa"/>
+          </w:tcPr>
+          <w:p>
+            <w:pPr>
+              <w:spacing w:line="480" w:lineRule="auto"/>
+              <w:rPr>
+                <w:rFonts w:ascii="Times New Roman" w:hAnsi="Times New Roman" w:cs="Times New Roman"/>
+              </w:rPr>
+            </w:pPr>
+            <w:r>
+              <w:rPr>
+                <w:rFonts w:ascii="Times New Roman" w:hAnsi="Times New Roman" w:cs="Times New Roman"/>
+              </w:rPr>
+              <w:t>Edge weight</w:t>
+            </w:r>
+          </w:p>
+        </w:tc>
+        <w:tc>
+          <w:tcPr>
+            <w:tcW w:w="3117" w:type="dxa"/>
+          </w:tcPr>
+          <w:p>
+            <w:pPr>
+              <w:spacing w:line="480" w:lineRule="auto"/>
+              <w:rPr>
+                <w:rFonts w:ascii="Times New Roman" w:hAnsi="Times New Roman" w:cs="Times New Roman"/>
+              </w:rPr>
+            </w:pPr>
+            <w:r>
+              <w:rPr>
+                <w:rFonts w:ascii="Times New Roman" w:hAnsi="Times New Roman" w:cs="Times New Roman"/>
+              </w:rPr>
+              <w:t>Time-sequence</w:t>
+            </w:r>
+          </w:p>
+        </w:tc>
+        <w:tc>
+          <w:tcPr>
+            <w:tcW w:w="3117" w:type="dxa"/>
+          </w:tcPr>
+          <w:p>
+            <w:pPr>
+              <w:spacing w:line="480" w:lineRule="auto"/>
+              <w:rPr>
+                <w:rFonts w:ascii="Times New Roman" w:hAnsi="Times New Roman" w:cs="Times New Roman"/>
+              </w:rPr>
+            </w:pPr>
+            <w:r>
+              <w:rPr>
+                <w:rFonts w:ascii="Times New Roman" w:hAnsi="Times New Roman" w:cs="Times New Roman"/>
+              </w:rPr>
+              <w:t>Mean edge weight</w:t>
+            </w:r>
+            <w:r>
+              <w:rPr>
+                <w:rFonts w:ascii="Times New Roman" w:hAnsi="Times New Roman" w:cs="Times New Roman"/>
+              </w:rPr>
+              <w:t>, Network-complexity, frequency of transition</w:t>
+            </w:r>
+          </w:p>
+        </w:tc>
+      </w:tr>
+      <w:tr>
+        <w:tc>
+          <w:tcPr>
+            <w:tcW w:w="3116" w:type="dxa"/>
+          </w:tcPr>
+          <w:p>
+            <w:pPr>
+              <w:spacing w:line="480" w:lineRule="auto"/>
+              <w:rPr>
+                <w:rFonts w:ascii="Times New Roman" w:hAnsi="Times New Roman" w:cs="Times New Roman"/>
+              </w:rPr>
+            </w:pPr>
+            <w:r>
+              <w:rPr>
+                <w:rFonts w:ascii="Times New Roman" w:hAnsi="Times New Roman" w:cs="Times New Roman"/>
+              </w:rPr>
+              <w:t>Skewness of edge weight</w:t>
+            </w:r>
+          </w:p>
+        </w:tc>
+        <w:tc>
+          <w:tcPr>
+            <w:tcW w:w="3117" w:type="dxa"/>
+          </w:tcPr>
+          <w:p>
+            <w:pPr>
+              <w:spacing w:line="480" w:lineRule="auto"/>
+              <w:rPr>
+                <w:rFonts w:ascii="Times New Roman" w:hAnsi="Times New Roman" w:cs="Times New Roman"/>
+              </w:rPr>
+            </w:pPr>
+            <w:r>
+              <w:rPr>
+                <w:rFonts w:ascii="Times New Roman" w:hAnsi="Times New Roman" w:cs="Times New Roman"/>
+              </w:rPr>
+              <w:t>Time-sequence</w:t>
+            </w:r>
+          </w:p>
+        </w:tc>
+        <w:tc>
+          <w:tcPr>
+            <w:tcW w:w="3117" w:type="dxa"/>
+          </w:tcPr>
+          <w:p>
+            <w:pPr>
+              <w:spacing w:line="480" w:lineRule="auto"/>
+              <w:rPr>
+                <w:rFonts w:ascii="Times New Roman" w:hAnsi="Times New Roman" w:cs="Times New Roman"/>
+              </w:rPr>
+            </w:pPr>
+            <w:r>
+              <w:rPr>
+                <w:rFonts w:ascii="Times New Roman" w:hAnsi="Times New Roman" w:cs="Times New Roman"/>
+              </w:rPr>
+              <w:t>Skewness of edge weights</w:t>
+            </w:r>
+            <w:r>
+              <w:rPr>
+                <w:rFonts w:ascii="Times New Roman" w:hAnsi="Times New Roman" w:cs="Times New Roman"/>
+              </w:rPr>
+              <w:t>, quantifies differences in transitions across nodes, Network-complexity</w:t>
+            </w:r>
+          </w:p>
+        </w:tc>
+      </w:tr>
+      <w:tr>
+        <w:tc>
+          <w:tcPr>
+            <w:tcW w:w="3116" w:type="dxa"/>
+          </w:tcPr>
+          <w:p>
+            <w:pPr>
+              <w:spacing w:line="480" w:lineRule="auto"/>
+              <w:rPr>
+                <w:rFonts w:ascii="Times New Roman" w:hAnsi="Times New Roman" w:cs="Times New Roman"/>
+              </w:rPr>
+            </w:pPr>
+            <w:r>
+              <w:rPr>
+                <w:rFonts w:ascii="Times New Roman" w:hAnsi="Times New Roman" w:cs="Times New Roman"/>
+              </w:rPr>
+              <w:t xml:space="preserve">(weighted) </w:t>
+            </w:r>
+            <w:proofErr w:type="spellStart"/>
+            <w:r>
+              <w:rPr>
+                <w:rFonts w:ascii="Times New Roman" w:hAnsi="Times New Roman" w:cs="Times New Roman"/>
+              </w:rPr>
+              <w:t>Connectance</w:t>
+            </w:r>
+            <w:proofErr w:type="spellEnd"/>
+          </w:p>
+        </w:tc>
+        <w:tc>
+          <w:tcPr>
+            <w:tcW w:w="3117" w:type="dxa"/>
+          </w:tcPr>
+          <w:p>
+            <w:pPr>
+              <w:spacing w:line="480" w:lineRule="auto"/>
+              <w:rPr>
+                <w:rFonts w:ascii="Times New Roman" w:hAnsi="Times New Roman" w:cs="Times New Roman"/>
+              </w:rPr>
+            </w:pPr>
+            <w:r>
+              <w:rPr>
+                <w:rFonts w:ascii="Times New Roman" w:hAnsi="Times New Roman" w:cs="Times New Roman"/>
+              </w:rPr>
+              <w:t>Time-sequence</w:t>
+            </w:r>
+          </w:p>
+        </w:tc>
+        <w:tc>
+          <w:tcPr>
+            <w:tcW w:w="3117" w:type="dxa"/>
+          </w:tcPr>
+          <w:p>
+            <w:pPr>
+              <w:spacing w:line="480" w:lineRule="auto"/>
+              <w:rPr>
+                <w:rFonts w:ascii="Times New Roman" w:hAnsi="Times New Roman" w:cs="Times New Roman"/>
+              </w:rPr>
+            </w:pPr>
+            <w:r>
+              <w:rPr>
+                <w:rFonts w:ascii="Times New Roman" w:hAnsi="Times New Roman" w:cs="Times New Roman"/>
+              </w:rPr>
+              <w:t>Average links per species</w:t>
+            </w:r>
+            <w:r>
+              <w:rPr>
+                <w:rFonts w:ascii="Times New Roman" w:hAnsi="Times New Roman" w:cs="Times New Roman"/>
+              </w:rPr>
+              <w:t>, Network complexity</w:t>
+            </w:r>
+            <w:r>
+              <w:rPr>
+                <w:rFonts w:ascii="Times New Roman" w:hAnsi="Times New Roman" w:cs="Times New Roman"/>
+              </w:rPr>
+              <w:t>, without /with edge weights</w:t>
+            </w:r>
+          </w:p>
+        </w:tc>
+      </w:tr>
+      <w:tr>
+        <w:tc>
+          <w:tcPr>
+            <w:tcW w:w="3116" w:type="dxa"/>
+          </w:tcPr>
+          <w:p>
+            <w:pPr>
+              <w:spacing w:line="480" w:lineRule="auto"/>
+              <w:rPr>
+                <w:rFonts w:ascii="Times New Roman" w:hAnsi="Times New Roman" w:cs="Times New Roman"/>
+              </w:rPr>
+            </w:pPr>
+            <w:r>
+              <w:rPr>
+                <w:rFonts w:ascii="Times New Roman" w:hAnsi="Times New Roman" w:cs="Times New Roman"/>
+              </w:rPr>
+              <w:t xml:space="preserve">(Weighted) </w:t>
+            </w:r>
+            <w:r>
+              <w:rPr>
+                <w:rFonts w:ascii="Times New Roman" w:hAnsi="Times New Roman" w:cs="Times New Roman"/>
+              </w:rPr>
+              <w:t>Betweenness</w:t>
+            </w:r>
+          </w:p>
+        </w:tc>
+        <w:tc>
+          <w:tcPr>
+            <w:tcW w:w="3117" w:type="dxa"/>
+          </w:tcPr>
+          <w:p>
+            <w:pPr>
+              <w:spacing w:line="480" w:lineRule="auto"/>
+              <w:rPr>
+                <w:rFonts w:ascii="Times New Roman" w:hAnsi="Times New Roman" w:cs="Times New Roman"/>
+              </w:rPr>
+            </w:pPr>
+            <w:r>
+              <w:rPr>
+                <w:rFonts w:ascii="Times New Roman" w:hAnsi="Times New Roman" w:cs="Times New Roman"/>
+              </w:rPr>
+              <w:t>Time-sequence</w:t>
+            </w:r>
+          </w:p>
+        </w:tc>
+        <w:tc>
+          <w:tcPr>
+            <w:tcW w:w="3117" w:type="dxa"/>
+          </w:tcPr>
+          <w:p>
+            <w:pPr>
+              <w:spacing w:line="480" w:lineRule="auto"/>
+              <w:rPr>
+                <w:rFonts w:ascii="Times New Roman" w:hAnsi="Times New Roman" w:cs="Times New Roman"/>
+              </w:rPr>
+            </w:pPr>
+          </w:p>
+        </w:tc>
+      </w:tr>
+      <w:tr>
+        <w:tc>
+          <w:tcPr>
+            <w:tcW w:w="3116" w:type="dxa"/>
+          </w:tcPr>
+          <w:p>
+            <w:pPr>
+              <w:spacing w:line="480" w:lineRule="auto"/>
+              <w:rPr>
+                <w:rFonts w:ascii="Times New Roman" w:hAnsi="Times New Roman" w:cs="Times New Roman"/>
+              </w:rPr>
+            </w:pPr>
+            <w:r>
+              <w:rPr>
+                <w:rFonts w:ascii="Times New Roman" w:hAnsi="Times New Roman" w:cs="Times New Roman"/>
+              </w:rPr>
+              <w:t>Modularity</w:t>
+            </w:r>
+          </w:p>
+        </w:tc>
+        <w:tc>
+          <w:tcPr>
+            <w:tcW w:w="3117" w:type="dxa"/>
+          </w:tcPr>
+          <w:p>
+            <w:pPr>
+              <w:spacing w:line="480" w:lineRule="auto"/>
+              <w:rPr>
+                <w:rFonts w:ascii="Times New Roman" w:hAnsi="Times New Roman" w:cs="Times New Roman"/>
+              </w:rPr>
+            </w:pPr>
+            <w:r>
+              <w:rPr>
+                <w:rFonts w:ascii="Times New Roman" w:hAnsi="Times New Roman" w:cs="Times New Roman"/>
+              </w:rPr>
+              <w:t>Time-sequence</w:t>
+            </w:r>
+          </w:p>
+        </w:tc>
+        <w:tc>
+          <w:tcPr>
+            <w:tcW w:w="3117" w:type="dxa"/>
+          </w:tcPr>
+          <w:p>
+            <w:pPr>
+              <w:spacing w:line="480" w:lineRule="auto"/>
+              <w:rPr>
+                <w:rFonts w:ascii="Times New Roman" w:hAnsi="Times New Roman" w:cs="Times New Roman"/>
+              </w:rPr>
+            </w:pPr>
+            <w:proofErr w:type="spellStart"/>
+            <w:r>
+              <w:rPr>
+                <w:rFonts w:ascii="Times New Roman" w:hAnsi="Times New Roman" w:cs="Times New Roman"/>
+              </w:rPr>
+              <w:t>Nestedness</w:t>
+            </w:r>
+            <w:proofErr w:type="spellEnd"/>
+            <w:r>
+              <w:rPr>
+                <w:rFonts w:ascii="Times New Roman" w:hAnsi="Times New Roman" w:cs="Times New Roman"/>
+              </w:rPr>
+              <w:t xml:space="preserve"> of network</w:t>
+            </w:r>
+          </w:p>
+        </w:tc>
+      </w:tr>
+      <w:tr>
+        <w:tc>
+          <w:tcPr>
+            <w:tcW w:w="3116" w:type="dxa"/>
+          </w:tcPr>
+          <w:p>
+            <w:pPr>
+              <w:spacing w:line="480" w:lineRule="auto"/>
+              <w:rPr>
+                <w:rFonts w:ascii="Times New Roman" w:hAnsi="Times New Roman" w:cs="Times New Roman"/>
+              </w:rPr>
+            </w:pPr>
+            <w:r>
+              <w:rPr>
+                <w:rFonts w:ascii="Times New Roman" w:hAnsi="Times New Roman" w:cs="Times New Roman"/>
+              </w:rPr>
+              <w:t>Mean Distance</w:t>
+            </w:r>
+          </w:p>
+        </w:tc>
+        <w:tc>
+          <w:tcPr>
+            <w:tcW w:w="3117" w:type="dxa"/>
+          </w:tcPr>
+          <w:p>
+            <w:pPr>
+              <w:spacing w:line="480" w:lineRule="auto"/>
+              <w:rPr>
+                <w:rFonts w:ascii="Times New Roman" w:hAnsi="Times New Roman" w:cs="Times New Roman"/>
+              </w:rPr>
+            </w:pPr>
+            <w:r>
+              <w:rPr>
+                <w:rFonts w:ascii="Times New Roman" w:hAnsi="Times New Roman" w:cs="Times New Roman"/>
+              </w:rPr>
+              <w:t>Time-sequence</w:t>
+            </w:r>
+          </w:p>
+        </w:tc>
+        <w:tc>
+          <w:tcPr>
+            <w:tcW w:w="3117" w:type="dxa"/>
+          </w:tcPr>
+          <w:p>
+            <w:pPr>
+              <w:spacing w:line="480" w:lineRule="auto"/>
+              <w:rPr>
+                <w:rFonts w:ascii="Times New Roman" w:hAnsi="Times New Roman" w:cs="Times New Roman"/>
+              </w:rPr>
+            </w:pPr>
+            <w:r>
+              <w:rPr>
+                <w:rFonts w:ascii="Times New Roman" w:hAnsi="Times New Roman" w:cs="Times New Roman"/>
+              </w:rPr>
+              <w:t>Distances between nodes</w:t>
+            </w:r>
+          </w:p>
+        </w:tc>
+      </w:tr>
+      <w:tr>
+        <w:tc>
+          <w:tcPr>
+            <w:tcW w:w="3116" w:type="dxa"/>
+          </w:tcPr>
+          <w:p>
+            <w:pPr>
+              <w:spacing w:line="480" w:lineRule="auto"/>
+              <w:rPr>
+                <w:rFonts w:ascii="Times New Roman" w:hAnsi="Times New Roman" w:cs="Times New Roman"/>
+              </w:rPr>
+            </w:pPr>
+            <w:r>
+              <w:rPr>
+                <w:rFonts w:ascii="Times New Roman" w:hAnsi="Times New Roman" w:cs="Times New Roman"/>
+              </w:rPr>
+              <w:t>Burstiness</w:t>
+            </w:r>
+          </w:p>
+        </w:tc>
+        <w:tc>
+          <w:tcPr>
+            <w:tcW w:w="3117" w:type="dxa"/>
+          </w:tcPr>
+          <w:p>
+            <w:pPr>
+              <w:spacing w:line="480" w:lineRule="auto"/>
+              <w:rPr>
+                <w:rFonts w:ascii="Times New Roman" w:hAnsi="Times New Roman" w:cs="Times New Roman"/>
+              </w:rPr>
+            </w:pPr>
+            <w:r>
+              <w:rPr>
+                <w:rFonts w:ascii="Times New Roman" w:hAnsi="Times New Roman" w:cs="Times New Roman"/>
+              </w:rPr>
+              <w:t>Time-duration</w:t>
+            </w:r>
+          </w:p>
+        </w:tc>
+        <w:tc>
+          <w:tcPr>
+            <w:tcW w:w="3117" w:type="dxa"/>
+          </w:tcPr>
+          <w:p>
+            <w:pPr>
+              <w:spacing w:line="480" w:lineRule="auto"/>
+              <w:rPr>
+                <w:rFonts w:ascii="Times New Roman" w:hAnsi="Times New Roman" w:cs="Times New Roman"/>
+              </w:rPr>
+            </w:pPr>
+            <w:r>
+              <w:rPr>
+                <w:rFonts w:ascii="Times New Roman" w:hAnsi="Times New Roman" w:cs="Times New Roman"/>
+              </w:rPr>
+              <w:t>Temporal distribution of changes in community state</w:t>
+            </w:r>
+          </w:p>
+        </w:tc>
+      </w:tr>
+      <w:tr>
+        <w:tc>
+          <w:tcPr>
+            <w:tcW w:w="3116" w:type="dxa"/>
+          </w:tcPr>
+          <w:p>
+            <w:pPr>
+              <w:spacing w:line="480" w:lineRule="auto"/>
+              <w:rPr>
+                <w:rFonts w:ascii="Times New Roman" w:hAnsi="Times New Roman" w:cs="Times New Roman"/>
+              </w:rPr>
+            </w:pPr>
+            <w:r>
+              <w:rPr>
+                <w:rFonts w:ascii="Times New Roman" w:hAnsi="Times New Roman" w:cs="Times New Roman"/>
+              </w:rPr>
+              <w:t>Memory</w:t>
+            </w:r>
+          </w:p>
+        </w:tc>
+        <w:tc>
+          <w:tcPr>
+            <w:tcW w:w="3117" w:type="dxa"/>
+          </w:tcPr>
+          <w:p>
+            <w:pPr>
+              <w:spacing w:line="480" w:lineRule="auto"/>
+              <w:rPr>
+                <w:rFonts w:ascii="Times New Roman" w:hAnsi="Times New Roman" w:cs="Times New Roman"/>
+              </w:rPr>
+            </w:pPr>
+            <w:r>
+              <w:rPr>
+                <w:rFonts w:ascii="Times New Roman" w:hAnsi="Times New Roman" w:cs="Times New Roman"/>
+              </w:rPr>
+              <w:t>Time-duration</w:t>
+            </w:r>
+          </w:p>
+        </w:tc>
+        <w:tc>
+          <w:tcPr>
+            <w:tcW w:w="3117" w:type="dxa"/>
+          </w:tcPr>
+          <w:p>
+            <w:pPr>
+              <w:spacing w:line="480" w:lineRule="auto"/>
+              <w:rPr>
+                <w:rFonts w:ascii="Times New Roman" w:hAnsi="Times New Roman" w:cs="Times New Roman"/>
+              </w:rPr>
+            </w:pPr>
+            <w:r>
+              <w:rPr>
+                <w:rFonts w:ascii="Times New Roman" w:hAnsi="Times New Roman" w:cs="Times New Roman"/>
+              </w:rPr>
+              <w:t>Correlation of duration between community transition events</w:t>
+            </w:r>
+          </w:p>
+        </w:tc>
+      </w:tr>
+      <w:tr>
+        <w:tc>
+          <w:tcPr>
+            <w:tcW w:w="3116" w:type="dxa"/>
+          </w:tcPr>
+          <w:p>
+            <w:pPr>
+              <w:spacing w:line="480" w:lineRule="auto"/>
+              <w:rPr>
+                <w:rFonts w:ascii="Times New Roman" w:hAnsi="Times New Roman" w:cs="Times New Roman"/>
+              </w:rPr>
+            </w:pPr>
+            <w:r>
+              <w:rPr>
+                <w:rFonts w:ascii="Times New Roman" w:hAnsi="Times New Roman" w:cs="Times New Roman"/>
+              </w:rPr>
+              <w:lastRenderedPageBreak/>
+              <w:t>Me</w:t>
+            </w:r>
+            <w:r>
+              <w:rPr>
+                <w:rFonts w:ascii="Times New Roman" w:hAnsi="Times New Roman" w:cs="Times New Roman"/>
+              </w:rPr>
+              <w:t>an</w:t>
+            </w:r>
+            <w:r>
+              <w:rPr>
+                <w:rFonts w:ascii="Times New Roman" w:hAnsi="Times New Roman" w:cs="Times New Roman"/>
+              </w:rPr>
+              <w:t xml:space="preserve"> Onset</w:t>
+            </w:r>
+          </w:p>
+        </w:tc>
+        <w:tc>
+          <w:tcPr>
+            <w:tcW w:w="3117" w:type="dxa"/>
+          </w:tcPr>
+          <w:p>
+            <w:pPr>
+              <w:spacing w:line="480" w:lineRule="auto"/>
+              <w:rPr>
+                <w:rFonts w:ascii="Times New Roman" w:hAnsi="Times New Roman" w:cs="Times New Roman"/>
+              </w:rPr>
+            </w:pPr>
+            <w:r>
+              <w:rPr>
+                <w:rFonts w:ascii="Times New Roman" w:hAnsi="Times New Roman" w:cs="Times New Roman"/>
+              </w:rPr>
+              <w:t>Time-timing</w:t>
+            </w:r>
+          </w:p>
+        </w:tc>
+        <w:tc>
+          <w:tcPr>
+            <w:tcW w:w="3117" w:type="dxa"/>
+          </w:tcPr>
+          <w:p>
+            <w:pPr>
+              <w:spacing w:line="480" w:lineRule="auto"/>
+              <w:rPr>
+                <w:rFonts w:ascii="Times New Roman" w:hAnsi="Times New Roman" w:cs="Times New Roman"/>
+              </w:rPr>
+            </w:pPr>
+            <w:r>
+              <w:rPr>
+                <w:rFonts w:ascii="Times New Roman" w:hAnsi="Times New Roman" w:cs="Times New Roman"/>
+              </w:rPr>
+              <w:t>Me</w:t>
+            </w:r>
+            <w:r>
+              <w:rPr>
+                <w:rFonts w:ascii="Times New Roman" w:hAnsi="Times New Roman" w:cs="Times New Roman"/>
+              </w:rPr>
+              <w:t xml:space="preserve">an </w:t>
+            </w:r>
+            <w:r>
+              <w:rPr>
+                <w:rFonts w:ascii="Times New Roman" w:hAnsi="Times New Roman" w:cs="Times New Roman"/>
+              </w:rPr>
+              <w:t>day of onset of community state</w:t>
+            </w:r>
+          </w:p>
+        </w:tc>
+      </w:tr>
+    </w:tbl>
     <w:p>
       <w:pPr>
         <w:spacing w:line="480" w:lineRule="auto"/>
-        <w:rPr>
-          <w:rFonts w:ascii="Times New Roman" w:hAnsi="Times New Roman" w:cs="Times New Roman"/>
-        </w:rPr>
-      </w:pPr>
-      <w:r>
-        <w:rPr>
-          <w:rFonts w:ascii="Times New Roman" w:hAnsi="Times New Roman" w:cs="Times New Roman"/>
-        </w:rPr>
-        <w:t>We converted species phenologies to transition networks of communities for each pond and cycle, resulting in total of 1</w:t>
-      </w:r>
-      <w:r>
-        <w:rPr>
-          <w:rFonts w:ascii="Times New Roman" w:hAnsi="Times New Roman" w:cs="Times New Roman"/>
-        </w:rPr>
-        <w:t>92</w:t>
-      </w:r>
-      <w:r>
-        <w:rPr>
-          <w:rFonts w:ascii="Times New Roman" w:hAnsi="Times New Roman" w:cs="Times New Roman"/>
-        </w:rPr>
-        <w:t xml:space="preserve"> individual community transition networks (2</w:t>
-      </w:r>
-      <w:r>
-        <w:rPr>
-          <w:rFonts w:ascii="Times New Roman" w:hAnsi="Times New Roman" w:cs="Times New Roman"/>
-        </w:rPr>
-        <w:t>4</w:t>
-      </w:r>
-      <w:r>
-        <w:rPr>
-          <w:rFonts w:ascii="Times New Roman" w:hAnsi="Times New Roman" w:cs="Times New Roman"/>
-        </w:rPr>
-        <w:t xml:space="preserve"> years x 8 sites).  </w:t>
-      </w:r>
-    </w:p>
-    <w:p>
-      <w:pPr>
-        <w:spacing w:line="480" w:lineRule="auto"/>
+        <w:ind w:firstLine="720"/>
         <w:rPr>
           <w:rFonts w:ascii="Times New Roman" w:hAnsi="Times New Roman" w:cs="Times New Roman"/>
         </w:rPr>
@@ -4024,8 +4778,777 @@
         <w:spacing w:line="480" w:lineRule="auto"/>
         <w:rPr>
           <w:rFonts w:ascii="Times New Roman" w:hAnsi="Times New Roman" w:cs="Times New Roman"/>
+          <w:i/>
+          <w:iCs/>
         </w:rPr>
       </w:pPr>
+      <w:r>
+        <w:rPr>
+          <w:rFonts w:ascii="Times New Roman" w:hAnsi="Times New Roman" w:cs="Times New Roman"/>
+          <w:i/>
+          <w:iCs/>
+        </w:rPr>
+        <w:t>Data analysis</w:t>
+      </w:r>
+    </w:p>
+    <w:p>
+      <w:pPr>
+        <w:spacing w:line="480" w:lineRule="auto"/>
+        <w:rPr>
+          <w:rFonts w:ascii="Times New Roman" w:hAnsi="Times New Roman" w:cs="Times New Roman"/>
+        </w:rPr>
+      </w:pPr>
+      <w:r>
+        <w:rPr>
+          <w:rFonts w:ascii="Times New Roman" w:hAnsi="Times New Roman" w:cs="Times New Roman"/>
+        </w:rPr>
+        <w:t>We converted species phenologies to transition networks of communities for each pond and cycle, resulting in total of 1</w:t>
+      </w:r>
+      <w:r>
+        <w:rPr>
+          <w:rFonts w:ascii="Times New Roman" w:hAnsi="Times New Roman" w:cs="Times New Roman"/>
+        </w:rPr>
+        <w:t>92</w:t>
+      </w:r>
+      <w:r>
+        <w:rPr>
+          <w:rFonts w:ascii="Times New Roman" w:hAnsi="Times New Roman" w:cs="Times New Roman"/>
+        </w:rPr>
+        <w:t xml:space="preserve"> individual community transition networks (2</w:t>
+      </w:r>
+      <w:r>
+        <w:rPr>
+          <w:rFonts w:ascii="Times New Roman" w:hAnsi="Times New Roman" w:cs="Times New Roman"/>
+        </w:rPr>
+        <w:t>4</w:t>
+      </w:r>
+      <w:r>
+        <w:rPr>
+          <w:rFonts w:ascii="Times New Roman" w:hAnsi="Times New Roman" w:cs="Times New Roman"/>
+        </w:rPr>
+        <w:t xml:space="preserve"> years x 8 sites). </w:t>
+      </w:r>
+      <w:r>
+        <w:rPr>
+          <w:rFonts w:ascii="Times New Roman" w:hAnsi="Times New Roman" w:cs="Times New Roman"/>
+        </w:rPr>
+        <w:t xml:space="preserve">We focused </w:t>
+      </w:r>
+      <w:r>
+        <w:rPr>
+          <w:rFonts w:ascii="Times New Roman" w:hAnsi="Times New Roman" w:cs="Times New Roman"/>
+        </w:rPr>
+        <w:t xml:space="preserve">on </w:t>
+      </w:r>
+      <w:r>
+        <w:rPr>
+          <w:rFonts w:ascii="Times New Roman" w:hAnsi="Times New Roman" w:cs="Times New Roman"/>
+        </w:rPr>
+        <w:t xml:space="preserve">different aspects of the temporal structure by calculating a range of </w:t>
+      </w:r>
+      <w:r>
+        <w:rPr>
+          <w:rFonts w:ascii="Times New Roman" w:hAnsi="Times New Roman" w:cs="Times New Roman"/>
+        </w:rPr>
+        <w:t xml:space="preserve">key </w:t>
+      </w:r>
+      <w:r>
+        <w:rPr>
+          <w:rFonts w:ascii="Times New Roman" w:hAnsi="Times New Roman" w:cs="Times New Roman"/>
+        </w:rPr>
+        <w:t>network metrics</w:t>
+      </w:r>
+      <w:r>
+        <w:rPr>
+          <w:rFonts w:ascii="Times New Roman" w:hAnsi="Times New Roman" w:cs="Times New Roman"/>
+        </w:rPr>
+        <w:t xml:space="preserve"> (Table 1)</w:t>
+      </w:r>
+      <w:r>
+        <w:rPr>
+          <w:rFonts w:ascii="Times New Roman" w:hAnsi="Times New Roman" w:cs="Times New Roman"/>
+        </w:rPr>
+        <w:t>. First</w:t>
+      </w:r>
+      <w:r>
+        <w:rPr>
+          <w:rFonts w:ascii="Times New Roman" w:hAnsi="Times New Roman" w:cs="Times New Roman"/>
+        </w:rPr>
+        <w:t>, we quantified the durations and frequency</w:t>
+      </w:r>
+      <w:r>
+        <w:rPr>
+          <w:rFonts w:ascii="Times New Roman" w:hAnsi="Times New Roman" w:cs="Times New Roman"/>
+        </w:rPr>
+        <w:t xml:space="preserve"> of occurrence</w:t>
+      </w:r>
+      <w:r>
+        <w:rPr>
+          <w:rFonts w:ascii="Times New Roman" w:hAnsi="Times New Roman" w:cs="Times New Roman"/>
+        </w:rPr>
+        <w:t>s</w:t>
+      </w:r>
+      <w:r>
+        <w:rPr>
+          <w:rFonts w:ascii="Times New Roman" w:hAnsi="Times New Roman" w:cs="Times New Roman"/>
+        </w:rPr>
+        <w:t xml:space="preserve"> of each state</w:t>
+      </w:r>
+      <w:r>
+        <w:rPr>
+          <w:rFonts w:ascii="Times New Roman" w:hAnsi="Times New Roman" w:cs="Times New Roman"/>
+        </w:rPr>
+        <w:t xml:space="preserve">, and how the latter two are correlated. We also calculated the burstiness </w:t>
+      </w:r>
+      <w:r>
+        <w:rPr>
+          <w:rFonts w:ascii="Times New Roman" w:hAnsi="Times New Roman" w:cs="Times New Roman"/>
+        </w:rPr>
+        <w:t xml:space="preserve">and memory </w:t>
+      </w:r>
+      <w:r>
+        <w:rPr>
+          <w:rFonts w:ascii="Times New Roman" w:hAnsi="Times New Roman" w:cs="Times New Roman"/>
+        </w:rPr>
+        <w:t>of state transitions to determine whether transitions occur randomly</w:t>
+      </w:r>
+      <w:r>
+        <w:rPr>
+          <w:rFonts w:ascii="Times New Roman" w:hAnsi="Times New Roman" w:cs="Times New Roman"/>
+        </w:rPr>
+        <w:t xml:space="preserve"> vs. </w:t>
+      </w:r>
+      <w:r>
+        <w:rPr>
+          <w:rFonts w:ascii="Times New Roman" w:hAnsi="Times New Roman" w:cs="Times New Roman"/>
+        </w:rPr>
+        <w:t xml:space="preserve">evenly spaced </w:t>
+      </w:r>
+      <w:r>
+        <w:rPr>
+          <w:rFonts w:ascii="Times New Roman" w:hAnsi="Times New Roman" w:cs="Times New Roman"/>
+        </w:rPr>
+        <w:t xml:space="preserve">vs. </w:t>
+      </w:r>
+      <w:r>
+        <w:rPr>
+          <w:rFonts w:ascii="Times New Roman" w:hAnsi="Times New Roman" w:cs="Times New Roman"/>
+        </w:rPr>
+        <w:t>aggregated in time</w:t>
+      </w:r>
+      <w:r>
+        <w:rPr>
+          <w:rFonts w:ascii="Times New Roman" w:hAnsi="Times New Roman" w:cs="Times New Roman"/>
+        </w:rPr>
+        <w:t>, and how intervals between events are correlated</w:t>
+      </w:r>
+      <w:r>
+        <w:rPr>
+          <w:rFonts w:ascii="Times New Roman" w:hAnsi="Times New Roman" w:cs="Times New Roman"/>
+        </w:rPr>
+        <w:t xml:space="preserve">. </w:t>
+      </w:r>
+      <w:r>
+        <w:rPr>
+          <w:rFonts w:ascii="Times New Roman" w:hAnsi="Times New Roman" w:cs="Times New Roman"/>
+        </w:rPr>
+        <w:t xml:space="preserve">At the community level, </w:t>
+      </w:r>
+      <w:r>
+        <w:rPr>
+          <w:rFonts w:ascii="Times New Roman" w:hAnsi="Times New Roman" w:cs="Times New Roman"/>
+        </w:rPr>
+        <w:t xml:space="preserve">we calculated the median cycle day of state onset (when ½ of the community states have occurred), </w:t>
+      </w:r>
+      <w:commentRangeStart w:id="2"/>
+      <w:r>
+        <w:rPr>
+          <w:rFonts w:ascii="Times New Roman" w:hAnsi="Times New Roman" w:cs="Times New Roman"/>
+        </w:rPr>
+        <w:t xml:space="preserve">and the rate of community change (changes in community state /day). </w:t>
+      </w:r>
+      <w:commentRangeEnd w:id="2"/>
+      <w:r>
+        <w:rPr>
+          <w:rStyle w:val="CommentReference"/>
+        </w:rPr>
+        <w:commentReference w:id="2"/>
+      </w:r>
+      <w:r>
+        <w:rPr>
+          <w:rFonts w:ascii="Times New Roman" w:hAnsi="Times New Roman" w:cs="Times New Roman"/>
+        </w:rPr>
+        <w:t xml:space="preserve">To quantify </w:t>
+      </w:r>
+      <w:r>
+        <w:rPr>
+          <w:rFonts w:ascii="Times New Roman" w:hAnsi="Times New Roman" w:cs="Times New Roman"/>
+        </w:rPr>
+        <w:t xml:space="preserve">the </w:t>
+      </w:r>
+      <w:r>
+        <w:rPr>
+          <w:rFonts w:ascii="Times New Roman" w:hAnsi="Times New Roman" w:cs="Times New Roman"/>
+        </w:rPr>
+        <w:t xml:space="preserve">sequence of transitions patterns </w:t>
+      </w:r>
+      <w:r>
+        <w:rPr>
+          <w:rFonts w:ascii="Times New Roman" w:hAnsi="Times New Roman" w:cs="Times New Roman"/>
+        </w:rPr>
+        <w:t>between community states, we converted the daily transition networks into a Markov transition network, where each link between nodes is directed and weighted by the frequency of its occurrence</w:t>
+      </w:r>
+      <w:r>
+        <w:rPr>
+          <w:rFonts w:ascii="Times New Roman" w:hAnsi="Times New Roman" w:cs="Times New Roman"/>
+        </w:rPr>
+        <w:t xml:space="preserve">. </w:t>
+      </w:r>
+      <w:r>
+        <w:rPr>
+          <w:rFonts w:ascii="Times New Roman" w:hAnsi="Times New Roman" w:cs="Times New Roman"/>
+        </w:rPr>
+        <w:t>For each network</w:t>
+      </w:r>
+      <w:r>
+        <w:rPr>
+          <w:rFonts w:ascii="Times New Roman" w:hAnsi="Times New Roman" w:cs="Times New Roman"/>
+        </w:rPr>
+        <w:t>,</w:t>
+      </w:r>
+      <w:r>
+        <w:rPr>
+          <w:rFonts w:ascii="Times New Roman" w:hAnsi="Times New Roman" w:cs="Times New Roman"/>
+        </w:rPr>
+        <w:t xml:space="preserve"> we calculated node and edge richness,</w:t>
+      </w:r>
+      <w:r>
+        <w:rPr>
+          <w:rFonts w:ascii="Times New Roman" w:hAnsi="Times New Roman" w:cs="Times New Roman"/>
+        </w:rPr>
+        <w:t xml:space="preserve"> skewness</w:t>
+      </w:r>
+      <w:r>
+        <w:rPr>
+          <w:rFonts w:ascii="Times New Roman" w:hAnsi="Times New Roman" w:cs="Times New Roman"/>
+        </w:rPr>
+        <w:t>,</w:t>
+      </w:r>
+      <w:r>
+        <w:rPr>
+          <w:rFonts w:ascii="Times New Roman" w:hAnsi="Times New Roman" w:cs="Times New Roman"/>
+        </w:rPr>
+        <w:t xml:space="preserve"> and </w:t>
+      </w:r>
+      <w:commentRangeStart w:id="3"/>
+      <w:r>
+        <w:rPr>
+          <w:rFonts w:ascii="Times New Roman" w:hAnsi="Times New Roman" w:cs="Times New Roman"/>
+        </w:rPr>
+        <w:t>evenness of edge weights (indicating similarity in transition frequency between states),</w:t>
+      </w:r>
+      <w:r>
+        <w:rPr>
+          <w:rFonts w:ascii="Times New Roman" w:hAnsi="Times New Roman" w:cs="Times New Roman"/>
+        </w:rPr>
+        <w:t xml:space="preserve"> </w:t>
+      </w:r>
+      <w:commentRangeEnd w:id="3"/>
+      <w:r>
+        <w:rPr>
+          <w:rStyle w:val="CommentReference"/>
+        </w:rPr>
+        <w:commentReference w:id="3"/>
+      </w:r>
+      <w:r>
+        <w:rPr>
+          <w:rFonts w:ascii="Times New Roman" w:hAnsi="Times New Roman" w:cs="Times New Roman"/>
+        </w:rPr>
+        <w:t xml:space="preserve">network </w:t>
+      </w:r>
+      <w:proofErr w:type="spellStart"/>
+      <w:r>
+        <w:rPr>
+          <w:rFonts w:ascii="Times New Roman" w:hAnsi="Times New Roman" w:cs="Times New Roman"/>
+        </w:rPr>
+        <w:t>connectance</w:t>
+      </w:r>
+      <w:proofErr w:type="spellEnd"/>
+      <w:r>
+        <w:rPr>
+          <w:rFonts w:ascii="Times New Roman" w:hAnsi="Times New Roman" w:cs="Times New Roman"/>
+        </w:rPr>
+        <w:t xml:space="preserve"> (with and without considering edge weights)</w:t>
+      </w:r>
+      <w:r>
+        <w:rPr>
+          <w:rFonts w:ascii="Times New Roman" w:hAnsi="Times New Roman" w:cs="Times New Roman"/>
+        </w:rPr>
+        <w:t>, modularity, mean distance between nodes, harmonic centrality, and betweenness</w:t>
+      </w:r>
+      <w:r>
+        <w:rPr>
+          <w:rFonts w:ascii="Times New Roman" w:hAnsi="Times New Roman" w:cs="Times New Roman"/>
+        </w:rPr>
+        <w:t xml:space="preserve"> (with and without considering edge weights)</w:t>
+      </w:r>
+      <w:r>
+        <w:rPr>
+          <w:rFonts w:ascii="Times New Roman" w:hAnsi="Times New Roman" w:cs="Times New Roman"/>
+        </w:rPr>
+        <w:t xml:space="preserve">. Together, these metrics provide a detailed picture of how the temporal structure of </w:t>
+      </w:r>
+      <w:proofErr w:type="gramStart"/>
+      <w:r>
+        <w:rPr>
+          <w:rFonts w:ascii="Times New Roman" w:hAnsi="Times New Roman" w:cs="Times New Roman"/>
+        </w:rPr>
+        <w:t>communities</w:t>
+      </w:r>
+      <w:proofErr w:type="gramEnd"/>
+      <w:r>
+        <w:rPr>
+          <w:rFonts w:ascii="Times New Roman" w:hAnsi="Times New Roman" w:cs="Times New Roman"/>
+        </w:rPr>
+        <w:t xml:space="preserve"> changes over a cycle at a given site and year.</w:t>
+      </w:r>
+    </w:p>
+    <w:p>
+      <w:pPr>
+        <w:spacing w:line="480" w:lineRule="auto"/>
+        <w:rPr>
+          <w:rFonts w:ascii="Times New Roman" w:hAnsi="Times New Roman" w:cs="Times New Roman"/>
+        </w:rPr>
+      </w:pPr>
+      <w:r>
+        <w:rPr>
+          <w:rFonts w:ascii="Times New Roman" w:hAnsi="Times New Roman" w:cs="Times New Roman"/>
+        </w:rPr>
+        <w:t xml:space="preserve">To test how variation in </w:t>
+      </w:r>
+      <w:r>
+        <w:rPr>
+          <w:rFonts w:ascii="Times New Roman" w:hAnsi="Times New Roman" w:cs="Times New Roman"/>
+        </w:rPr>
+        <w:t>climate</w:t>
+      </w:r>
+      <w:r>
+        <w:rPr>
+          <w:rFonts w:ascii="Times New Roman" w:hAnsi="Times New Roman" w:cs="Times New Roman"/>
+        </w:rPr>
+        <w:t xml:space="preserve"> affected the community transition patterns, we first standardized all climate metrics using</w:t>
+      </w:r>
+      <w:r>
+        <w:rPr>
+          <w:rFonts w:ascii="Times New Roman" w:hAnsi="Times New Roman" w:cs="Times New Roman"/>
+        </w:rPr>
+        <w:t xml:space="preserve"> a</w:t>
+      </w:r>
+      <w:r>
+        <w:rPr>
+          <w:rFonts w:ascii="Times New Roman" w:hAnsi="Times New Roman" w:cs="Times New Roman"/>
+        </w:rPr>
+        <w:t xml:space="preserve"> z-score transformation</w:t>
+      </w:r>
+      <w:r>
+        <w:rPr>
+          <w:rFonts w:ascii="Times New Roman" w:hAnsi="Times New Roman" w:cs="Times New Roman"/>
+        </w:rPr>
+        <w:t xml:space="preserve"> (each variable has a </w:t>
+      </w:r>
+      <w:r>
+        <w:rPr>
+          <w:rFonts w:ascii="Times New Roman" w:hAnsi="Times New Roman" w:cs="Times New Roman"/>
+        </w:rPr>
+        <w:t xml:space="preserve">mean of 0 and </w:t>
+      </w:r>
+      <w:r>
+        <w:rPr>
+          <w:rFonts w:ascii="Times New Roman" w:hAnsi="Times New Roman" w:cs="Times New Roman"/>
+        </w:rPr>
+        <w:t xml:space="preserve">a </w:t>
+      </w:r>
+      <w:r>
+        <w:rPr>
+          <w:rFonts w:ascii="Times New Roman" w:hAnsi="Times New Roman" w:cs="Times New Roman"/>
+        </w:rPr>
+        <w:t xml:space="preserve">standard </w:t>
+      </w:r>
+      <w:r>
+        <w:rPr>
+          <w:rFonts w:ascii="Times New Roman" w:hAnsi="Times New Roman" w:cs="Times New Roman"/>
+        </w:rPr>
+        <w:lastRenderedPageBreak/>
+        <w:t xml:space="preserve">deviation </w:t>
+      </w:r>
+      <w:r>
+        <w:rPr>
+          <w:rFonts w:ascii="Times New Roman" w:hAnsi="Times New Roman" w:cs="Times New Roman"/>
+        </w:rPr>
+        <w:t>of 1</w:t>
+      </w:r>
+      <w:r>
+        <w:rPr>
+          <w:rFonts w:ascii="Times New Roman" w:hAnsi="Times New Roman" w:cs="Times New Roman"/>
+        </w:rPr>
+        <w:t>)</w:t>
+      </w:r>
+      <w:r>
+        <w:rPr>
+          <w:rFonts w:ascii="Times New Roman" w:hAnsi="Times New Roman" w:cs="Times New Roman"/>
+        </w:rPr>
+        <w:t xml:space="preserve">. We then </w:t>
+      </w:r>
+      <w:r>
+        <w:rPr>
+          <w:rFonts w:ascii="Times New Roman" w:hAnsi="Times New Roman" w:cs="Times New Roman"/>
+        </w:rPr>
+        <w:t xml:space="preserve">used </w:t>
+      </w:r>
+      <w:r>
+        <w:rPr>
+          <w:rFonts w:ascii="Times New Roman" w:hAnsi="Times New Roman" w:cs="Times New Roman"/>
+        </w:rPr>
+        <w:t xml:space="preserve">a </w:t>
+      </w:r>
+      <w:r>
+        <w:rPr>
+          <w:rFonts w:ascii="Times New Roman" w:hAnsi="Times New Roman" w:cs="Times New Roman"/>
+        </w:rPr>
+        <w:t>PCA analysis on these standardized metrics</w:t>
+      </w:r>
+      <w:r>
+        <w:rPr>
+          <w:rFonts w:ascii="Times New Roman" w:hAnsi="Times New Roman" w:cs="Times New Roman"/>
+        </w:rPr>
+        <w:t xml:space="preserve"> to </w:t>
+      </w:r>
+      <w:r>
+        <w:rPr>
+          <w:rFonts w:ascii="Times New Roman" w:hAnsi="Times New Roman" w:cs="Times New Roman"/>
+        </w:rPr>
+        <w:t xml:space="preserve">mitigate issues of variance inflation caused by the inherent collinearity among </w:t>
+      </w:r>
+      <w:r>
+        <w:rPr>
+          <w:rFonts w:ascii="Times New Roman" w:hAnsi="Times New Roman" w:cs="Times New Roman"/>
+        </w:rPr>
+        <w:t>climate metrics</w:t>
+      </w:r>
+      <w:r>
+        <w:rPr>
+          <w:rFonts w:ascii="Times New Roman" w:hAnsi="Times New Roman" w:cs="Times New Roman"/>
+        </w:rPr>
+        <w:t xml:space="preserve">. The PCA </w:t>
+      </w:r>
+      <w:r>
+        <w:rPr>
+          <w:rFonts w:ascii="Times New Roman" w:hAnsi="Times New Roman" w:cs="Times New Roman"/>
+        </w:rPr>
+        <w:t xml:space="preserve">analysis </w:t>
+      </w:r>
+      <w:r>
+        <w:rPr>
+          <w:rFonts w:ascii="Times New Roman" w:hAnsi="Times New Roman" w:cs="Times New Roman"/>
+        </w:rPr>
+        <w:t xml:space="preserve">showed that </w:t>
+      </w:r>
+      <w:r>
+        <w:rPr>
+          <w:rFonts w:ascii="Times New Roman" w:hAnsi="Times New Roman" w:cs="Times New Roman"/>
+        </w:rPr>
+        <w:t>78</w:t>
+      </w:r>
+      <w:r>
+        <w:rPr>
+          <w:rFonts w:ascii="Times New Roman" w:hAnsi="Times New Roman" w:cs="Times New Roman"/>
+        </w:rPr>
+        <w:t xml:space="preserve">% of </w:t>
+      </w:r>
+      <w:r>
+        <w:rPr>
+          <w:rFonts w:ascii="Times New Roman" w:hAnsi="Times New Roman" w:cs="Times New Roman"/>
+        </w:rPr>
+        <w:t xml:space="preserve">the </w:t>
+      </w:r>
+      <w:r>
+        <w:rPr>
+          <w:rFonts w:ascii="Times New Roman" w:hAnsi="Times New Roman" w:cs="Times New Roman"/>
+        </w:rPr>
+        <w:t xml:space="preserve">variation in the metrics could be captured by </w:t>
+      </w:r>
+      <w:r>
+        <w:rPr>
+          <w:rFonts w:ascii="Times New Roman" w:hAnsi="Times New Roman" w:cs="Times New Roman"/>
+        </w:rPr>
+        <w:t xml:space="preserve">just </w:t>
+      </w:r>
+      <w:r>
+        <w:rPr>
+          <w:rFonts w:ascii="Times New Roman" w:hAnsi="Times New Roman" w:cs="Times New Roman"/>
+        </w:rPr>
+        <w:t xml:space="preserve">the first </w:t>
+      </w:r>
+      <w:r>
+        <w:rPr>
+          <w:rFonts w:ascii="Times New Roman" w:hAnsi="Times New Roman" w:cs="Times New Roman"/>
+        </w:rPr>
+        <w:t xml:space="preserve">two </w:t>
+      </w:r>
+      <w:r>
+        <w:rPr>
+          <w:rFonts w:ascii="Times New Roman" w:hAnsi="Times New Roman" w:cs="Times New Roman"/>
+        </w:rPr>
+        <w:t>principal component</w:t>
+      </w:r>
+      <w:r>
+        <w:rPr>
+          <w:rFonts w:ascii="Times New Roman" w:hAnsi="Times New Roman" w:cs="Times New Roman"/>
+        </w:rPr>
+        <w:t>s</w:t>
+      </w:r>
+      <w:r>
+        <w:rPr>
+          <w:rFonts w:ascii="Times New Roman" w:hAnsi="Times New Roman" w:cs="Times New Roman"/>
+        </w:rPr>
+        <w:t xml:space="preserve"> (PC1</w:t>
+      </w:r>
+      <w:r>
+        <w:rPr>
+          <w:rFonts w:ascii="Times New Roman" w:hAnsi="Times New Roman" w:cs="Times New Roman"/>
+        </w:rPr>
+        <w:t>= 54</w:t>
+      </w:r>
+      <w:r>
+        <w:rPr>
+          <w:rFonts w:ascii="Times New Roman" w:hAnsi="Times New Roman" w:cs="Times New Roman"/>
+        </w:rPr>
+        <w:t>.3</w:t>
+      </w:r>
+      <w:r>
+        <w:rPr>
+          <w:rFonts w:ascii="Times New Roman" w:hAnsi="Times New Roman" w:cs="Times New Roman"/>
+        </w:rPr>
+        <w:t xml:space="preserve">% </w:t>
+      </w:r>
+      <w:r>
+        <w:rPr>
+          <w:rFonts w:ascii="Times New Roman" w:hAnsi="Times New Roman" w:cs="Times New Roman"/>
+        </w:rPr>
+        <w:t>&amp; PC2</w:t>
+      </w:r>
+      <w:r>
+        <w:rPr>
+          <w:rFonts w:ascii="Times New Roman" w:hAnsi="Times New Roman" w:cs="Times New Roman"/>
+        </w:rPr>
+        <w:t xml:space="preserve"> =2</w:t>
+      </w:r>
+      <w:r>
+        <w:rPr>
+          <w:rFonts w:ascii="Times New Roman" w:hAnsi="Times New Roman" w:cs="Times New Roman"/>
+        </w:rPr>
+        <w:t>3.8</w:t>
+      </w:r>
+      <w:r>
+        <w:rPr>
+          <w:rFonts w:ascii="Times New Roman" w:hAnsi="Times New Roman" w:cs="Times New Roman"/>
+        </w:rPr>
+        <w:t>%</w:t>
+      </w:r>
+      <w:r>
+        <w:rPr>
+          <w:rFonts w:ascii="Times New Roman" w:hAnsi="Times New Roman" w:cs="Times New Roman"/>
+        </w:rPr>
+        <w:t>)</w:t>
+      </w:r>
+      <w:r>
+        <w:rPr>
+          <w:rFonts w:ascii="Times New Roman" w:hAnsi="Times New Roman" w:cs="Times New Roman"/>
+        </w:rPr>
+        <w:t xml:space="preserve"> and any subsequent </w:t>
+      </w:r>
+      <w:r>
+        <w:rPr>
+          <w:rFonts w:ascii="Times New Roman" w:hAnsi="Times New Roman" w:cs="Times New Roman"/>
+        </w:rPr>
+        <w:t xml:space="preserve">principal </w:t>
+      </w:r>
+      <w:r>
+        <w:rPr>
+          <w:rFonts w:ascii="Times New Roman" w:hAnsi="Times New Roman" w:cs="Times New Roman"/>
+        </w:rPr>
+        <w:t>component added &lt;</w:t>
+      </w:r>
+      <w:r>
+        <w:rPr>
+          <w:rFonts w:ascii="Times New Roman" w:hAnsi="Times New Roman" w:cs="Times New Roman"/>
+        </w:rPr>
+        <w:t>7.6</w:t>
+      </w:r>
+      <w:r>
+        <w:rPr>
+          <w:rFonts w:ascii="Times New Roman" w:hAnsi="Times New Roman" w:cs="Times New Roman"/>
+        </w:rPr>
+        <w:t>% (Supplement Fig on Axis, see Supplement Fig x for axis loading).</w:t>
+      </w:r>
+      <w:r>
+        <w:rPr>
+          <w:rFonts w:ascii="Times New Roman" w:hAnsi="Times New Roman" w:cs="Times New Roman"/>
+        </w:rPr>
+        <w:t xml:space="preserve"> We used general linear mixed models </w:t>
+      </w:r>
+      <w:r>
+        <w:rPr>
+          <w:rFonts w:ascii="Times New Roman" w:hAnsi="Times New Roman" w:cs="Times New Roman"/>
+        </w:rPr>
+        <w:t>and the respective network metrics as response variables</w:t>
+      </w:r>
+      <w:r>
+        <w:rPr>
+          <w:rFonts w:ascii="Times New Roman" w:hAnsi="Times New Roman" w:cs="Times New Roman"/>
+        </w:rPr>
+        <w:t xml:space="preserve">, the first two weather principal components and year as predictors, and pond (site) as a </w:t>
+      </w:r>
+      <w:r>
+        <w:rPr>
+          <w:rFonts w:ascii="Times New Roman" w:hAnsi="Times New Roman" w:cs="Times New Roman"/>
+        </w:rPr>
+        <w:t xml:space="preserve">random effect.  </w:t>
+      </w:r>
+      <w:r>
+        <w:rPr>
+          <w:rFonts w:ascii="Times New Roman" w:hAnsi="Times New Roman" w:cs="Times New Roman"/>
+        </w:rPr>
+        <w:t>All models fi</w:t>
+      </w:r>
+      <w:r>
+        <w:rPr>
+          <w:rFonts w:ascii="Times New Roman" w:hAnsi="Times New Roman" w:cs="Times New Roman"/>
+        </w:rPr>
+        <w:t>t</w:t>
+      </w:r>
+      <w:r>
+        <w:rPr>
+          <w:rFonts w:ascii="Times New Roman" w:hAnsi="Times New Roman" w:cs="Times New Roman"/>
+        </w:rPr>
+        <w:t xml:space="preserve"> best with </w:t>
+      </w:r>
+      <w:r>
+        <w:rPr>
+          <w:rFonts w:ascii="Times New Roman" w:hAnsi="Times New Roman" w:cs="Times New Roman"/>
+        </w:rPr>
+        <w:t xml:space="preserve">normally distributed errors, except </w:t>
+      </w:r>
+      <w:proofErr w:type="spellStart"/>
+      <w:r>
+        <w:rPr>
+          <w:rFonts w:ascii="Times New Roman" w:hAnsi="Times New Roman" w:cs="Times New Roman"/>
+        </w:rPr>
+        <w:t>Connectance</w:t>
+      </w:r>
+      <w:proofErr w:type="spellEnd"/>
+      <w:r>
+        <w:rPr>
+          <w:rFonts w:ascii="Times New Roman" w:hAnsi="Times New Roman" w:cs="Times New Roman"/>
+        </w:rPr>
+        <w:t xml:space="preserve"> and mean Distance, which were both log-transformed</w:t>
+      </w:r>
+      <w:r>
+        <w:rPr>
+          <w:rFonts w:ascii="Times New Roman" w:hAnsi="Times New Roman" w:cs="Times New Roman"/>
+        </w:rPr>
+        <w:t xml:space="preserve"> to improve model </w:t>
+      </w:r>
+      <w:proofErr w:type="gramStart"/>
+      <w:r>
+        <w:rPr>
+          <w:rFonts w:ascii="Times New Roman" w:hAnsi="Times New Roman" w:cs="Times New Roman"/>
+        </w:rPr>
+        <w:t>fit</w:t>
+      </w:r>
+      <w:proofErr w:type="gramEnd"/>
+      <w:r>
+        <w:rPr>
+          <w:rFonts w:ascii="Times New Roman" w:hAnsi="Times New Roman" w:cs="Times New Roman"/>
+        </w:rPr>
+        <w:t xml:space="preserve"> and error distribution assumptions. </w:t>
+      </w:r>
+    </w:p>
+    <w:p>
+      <w:pPr>
+        <w:spacing w:line="480" w:lineRule="auto"/>
+        <w:rPr>
+          <w:rFonts w:ascii="Times New Roman" w:hAnsi="Times New Roman" w:cs="Times New Roman"/>
+        </w:rPr>
+      </w:pPr>
+    </w:p>
+    <w:p>
+      <w:pPr>
+        <w:spacing w:line="480" w:lineRule="auto"/>
+        <w:rPr>
+          <w:rFonts w:ascii="Times New Roman" w:hAnsi="Times New Roman" w:cs="Times New Roman"/>
+          <w:b/>
+          <w:bCs/>
+        </w:rPr>
+      </w:pPr>
+      <w:commentRangeStart w:id="4"/>
+      <w:r>
+        <w:rPr>
+          <w:rFonts w:ascii="Times New Roman" w:hAnsi="Times New Roman" w:cs="Times New Roman"/>
+          <w:b/>
+          <w:bCs/>
+        </w:rPr>
+        <w:t>Results</w:t>
+      </w:r>
+      <w:commentRangeEnd w:id="4"/>
+      <w:r>
+        <w:rPr>
+          <w:rStyle w:val="CommentReference"/>
+        </w:rPr>
+        <w:commentReference w:id="4"/>
+      </w:r>
+      <w:r>
+        <w:rPr>
+          <w:rFonts w:ascii="Times New Roman" w:hAnsi="Times New Roman" w:cs="Times New Roman"/>
+          <w:b/>
+          <w:bCs/>
+        </w:rPr>
+        <w:t xml:space="preserve"> </w:t>
+      </w:r>
+    </w:p>
+    <w:p>
+      <w:pPr>
+        <w:spacing w:line="480" w:lineRule="auto"/>
+        <w:rPr>
+          <w:rFonts w:ascii="Times New Roman" w:hAnsi="Times New Roman" w:cs="Times New Roman"/>
+        </w:rPr>
+      </w:pPr>
+    </w:p>
+    <w:p>
+      <w:pPr>
+        <w:spacing w:line="480" w:lineRule="auto"/>
+        <w:rPr>
+          <w:rFonts w:ascii="Times New Roman" w:hAnsi="Times New Roman" w:cs="Times New Roman"/>
+        </w:rPr>
+      </w:pPr>
+    </w:p>
+    <w:p>
+      <w:pPr>
+        <w:spacing w:line="480" w:lineRule="auto"/>
+        <w:rPr>
+          <w:rFonts w:ascii="Times New Roman" w:hAnsi="Times New Roman" w:cs="Times New Roman"/>
+          <w:b/>
+          <w:bCs/>
+        </w:rPr>
+      </w:pPr>
+      <w:r>
+        <w:rPr>
+          <w:rFonts w:ascii="Times New Roman" w:hAnsi="Times New Roman" w:cs="Times New Roman"/>
+          <w:b/>
+          <w:bCs/>
+        </w:rPr>
+        <w:t>References</w:t>
+      </w:r>
     </w:p>
     <w:p>
       <w:pPr>
@@ -4080,7 +5603,6 @@
         <w:ind w:left="720" w:hanging="720"/>
       </w:pPr>
       <w:r>
-        <w:lastRenderedPageBreak/>
         <w:t xml:space="preserve">Carter, S.K. &amp; Rudolf, V.H.W. (2019). Shifts in phenological mean and synchrony interact to shape competitive outcomes. </w:t>
       </w:r>
       <w:r>
@@ -4155,6 +5677,7 @@
         <w:ind w:left="720" w:hanging="720"/>
       </w:pPr>
       <w:r>
+        <w:lastRenderedPageBreak/>
         <w:t>5.</w:t>
       </w:r>
     </w:p>
@@ -4347,6 +5870,132 @@
     </w:sectPr>
   </w:body>
 </w:document>
+</file>
+
+<file path=word/comments.xml><?xml version="1.0" encoding="utf-8"?>
+<w:comments xmlns:wpc="http://schemas.microsoft.com/office/word/2010/wordprocessingCanvas" xmlns:cx="http://schemas.microsoft.com/office/drawing/2014/chartex" xmlns:cx1="http://schemas.microsoft.com/office/drawing/2015/9/8/chartex" xmlns:cx2="http://schemas.microsoft.com/office/drawing/2015/10/21/chartex" xmlns:cx3="http://schemas.microsoft.com/office/drawing/2016/5/9/chartex" xmlns:cx4="http://schemas.microsoft.com/office/drawing/2016/5/10/chartex" xmlns:cx5="http://schemas.microsoft.com/office/drawing/2016/5/11/chartex" xmlns:cx6="http://schemas.microsoft.com/office/drawing/2016/5/12/chartex" xmlns:cx7="http://schemas.microsoft.com/office/drawing/2016/5/13/chartex" xmlns:cx8="http://schemas.microsoft.com/office/drawing/2016/5/14/chartex" xmlns:mc="http://schemas.openxmlformats.org/markup-compatibility/2006" xmlns:aink="http://schemas.microsoft.com/office/drawing/2016/ink" xmlns:am3d="http://schemas.microsoft.com/office/drawing/2017/model3d" xmlns:o="urn:schemas-microsoft-com:office:office" xmlns:oel="http://schemas.microsoft.com/office/2019/extlst" xmlns:r="http://schemas.openxmlformats.org/officeDocument/2006/relationships" xmlns:m="http://schemas.openxmlformats.org/officeDocument/2006/math" xmlns:v="urn:schemas-microsoft-com:vml" xmlns:wp14="http://schemas.microsoft.com/office/word/2010/wordprocessingDrawing" xmlns:wp="http://schemas.openxmlformats.org/drawingml/2006/wordprocessingDrawing" xmlns:w10="urn:schemas-microsoft-com:office:word" xmlns:w="http://schemas.openxmlformats.org/wordprocessingml/2006/main" xmlns:w14="http://schemas.microsoft.com/office/word/2010/wordml" xmlns:w15="http://schemas.microsoft.com/office/word/2012/wordml" xmlns:w16cex="http://schemas.microsoft.com/office/word/2018/wordml/cex" xmlns:w16cid="http://schemas.microsoft.com/office/word/2016/wordml/cid" xmlns:w16="http://schemas.microsoft.com/office/word/2018/wordml" xmlns:w16du="http://schemas.microsoft.com/office/word/2023/wordml/word16du" xmlns:w16sdtdh="http://schemas.microsoft.com/office/word/2020/wordml/sdtdatahash" xmlns:w16sdtfl="http://schemas.microsoft.com/office/word/2024/wordml/sdtformatlock" xmlns:w16se="http://schemas.microsoft.com/office/word/2015/wordml/symex" xmlns:wpg="http://schemas.microsoft.com/office/word/2010/wordprocessingGroup" xmlns:wpi="http://schemas.microsoft.com/office/word/2010/wordprocessingInk" xmlns:wne="http://schemas.microsoft.com/office/word/2006/wordml" xmlns:wps="http://schemas.microsoft.com/office/word/2010/wordprocessingShape" mc:Ignorable="w14 w15 w16se w16cid w16 w16cex w16sdtdh w16sdtfl w16du wp14">
+  <w:comment w:id="0" w:author="Volker Rudolf" w:date="2025-11-04T13:19:00Z" w:initials="VR">
+    <w:p>
+      <w:pPr>
+        <w:pStyle w:val="CommentText"/>
+      </w:pPr>
+      <w:r>
+        <w:rPr>
+          <w:rStyle w:val="CommentReference"/>
+        </w:rPr>
+        <w:annotationRef/>
+      </w:r>
+      <w:r>
+        <w:t>Missing a take home message here...</w:t>
+      </w:r>
+    </w:p>
+  </w:comment>
+  <w:comment w:id="1" w:author="Volker Rudolf" w:date="2025-10-14T11:34:00Z" w:initials="VR">
+    <w:p>
+      <w:pPr>
+        <w:pStyle w:val="CommentText"/>
+      </w:pPr>
+      <w:r>
+        <w:rPr>
+          <w:rStyle w:val="CommentReference"/>
+        </w:rPr>
+        <w:annotationRef/>
+      </w:r>
+      <w:r>
+        <w:t>Not useful, let’s drop that one</w:t>
+      </w:r>
+    </w:p>
+  </w:comment>
+  <w:comment w:id="2" w:author="Volker Rudolf" w:date="2025-11-04T14:35:00Z" w:initials="VR">
+    <w:p>
+      <w:pPr>
+        <w:pStyle w:val="CommentText"/>
+      </w:pPr>
+      <w:r>
+        <w:rPr>
+          <w:rStyle w:val="CommentReference"/>
+        </w:rPr>
+        <w:annotationRef/>
+      </w:r>
+      <w:r>
+        <w:t>Might not be needed. At some point we need to narrow it down a bit.</w:t>
+      </w:r>
+    </w:p>
+  </w:comment>
+  <w:comment w:id="3" w:author="Volker Rudolf" w:date="2025-11-04T14:40:00Z" w:initials="VR">
+    <w:p>
+      <w:pPr>
+        <w:pStyle w:val="CommentText"/>
+      </w:pPr>
+      <w:r>
+        <w:rPr>
+          <w:rStyle w:val="CommentReference"/>
+        </w:rPr>
+        <w:annotationRef/>
+      </w:r>
+      <w:r>
+        <w:t>Needed?</w:t>
+      </w:r>
+    </w:p>
+  </w:comment>
+  <w:comment w:id="4" w:author="Volker Rudolf" w:date="2025-11-05T10:12:00Z" w:initials="VR">
+    <w:p>
+      <w:pPr>
+        <w:pStyle w:val="CommentText"/>
+      </w:pPr>
+      <w:r>
+        <w:rPr>
+          <w:rStyle w:val="CommentReference"/>
+        </w:rPr>
+        <w:annotationRef/>
+      </w:r>
+      <w:r>
+        <w:t xml:space="preserve">Check out </w:t>
+      </w:r>
+      <w:hyperlink r:id="rId1" w:history="1">
+        <w:r>
+          <w:rPr>
+            <w:rStyle w:val="Hyperlink"/>
+          </w:rPr>
+          <w:t>https://onlinelibrary.wiley.com/doi/pdf/10.1111/ele.70212</w:t>
+        </w:r>
+      </w:hyperlink>
+      <w:r>
+        <w:t xml:space="preserve"> for visualization ideas</w:t>
+      </w:r>
+    </w:p>
+  </w:comment>
+</w:comments>
+</file>
+
+<file path=word/commentsExtended.xml><?xml version="1.0" encoding="utf-8"?>
+<w15:commentsEx xmlns:wpc="http://schemas.microsoft.com/office/word/2010/wordprocessingCanvas" xmlns:cx="http://schemas.microsoft.com/office/drawing/2014/chartex" xmlns:cx1="http://schemas.microsoft.com/office/drawing/2015/9/8/chartex" xmlns:cx2="http://schemas.microsoft.com/office/drawing/2015/10/21/chartex" xmlns:cx3="http://schemas.microsoft.com/office/drawing/2016/5/9/chartex" xmlns:cx4="http://schemas.microsoft.com/office/drawing/2016/5/10/chartex" xmlns:cx5="http://schemas.microsoft.com/office/drawing/2016/5/11/chartex" xmlns:cx6="http://schemas.microsoft.com/office/drawing/2016/5/12/chartex" xmlns:cx7="http://schemas.microsoft.com/office/drawing/2016/5/13/chartex" xmlns:cx8="http://schemas.microsoft.com/office/drawing/2016/5/14/chartex" xmlns:mc="http://schemas.openxmlformats.org/markup-compatibility/2006" xmlns:aink="http://schemas.microsoft.com/office/drawing/2016/ink" xmlns:am3d="http://schemas.microsoft.com/office/drawing/2017/model3d" xmlns:o="urn:schemas-microsoft-com:office:office" xmlns:oel="http://schemas.microsoft.com/office/2019/extlst" xmlns:r="http://schemas.openxmlformats.org/officeDocument/2006/relationships" xmlns:m="http://schemas.openxmlformats.org/officeDocument/2006/math" xmlns:v="urn:schemas-microsoft-com:vml" xmlns:wp14="http://schemas.microsoft.com/office/word/2010/wordprocessingDrawing" xmlns:wp="http://schemas.openxmlformats.org/drawingml/2006/wordprocessingDrawing" xmlns:w10="urn:schemas-microsoft-com:office:word" xmlns:w="http://schemas.openxmlformats.org/wordprocessingml/2006/main" xmlns:w14="http://schemas.microsoft.com/office/word/2010/wordml" xmlns:w15="http://schemas.microsoft.com/office/word/2012/wordml" xmlns:w16cex="http://schemas.microsoft.com/office/word/2018/wordml/cex" xmlns:w16cid="http://schemas.microsoft.com/office/word/2016/wordml/cid" xmlns:w16="http://schemas.microsoft.com/office/word/2018/wordml" xmlns:w16du="http://schemas.microsoft.com/office/word/2023/wordml/word16du" xmlns:w16sdtdh="http://schemas.microsoft.com/office/word/2020/wordml/sdtdatahash" xmlns:w16sdtfl="http://schemas.microsoft.com/office/word/2024/wordml/sdtformatlock" xmlns:w16se="http://schemas.microsoft.com/office/word/2015/wordml/symex" xmlns:wpg="http://schemas.microsoft.com/office/word/2010/wordprocessingGroup" xmlns:wpi="http://schemas.microsoft.com/office/word/2010/wordprocessingInk" xmlns:wne="http://schemas.microsoft.com/office/word/2006/wordml" xmlns:wps="http://schemas.microsoft.com/office/word/2010/wordprocessingShape" mc:Ignorable="w14 w15 w16se w16cid w16 w16cex w16sdtdh w16sdtfl w16du wp14">
+  <w15:commentEx w15:paraId="47D268E1" w15:done="0"/>
+  <w15:commentEx w15:paraId="4386FF68" w15:done="0"/>
+  <w15:commentEx w15:paraId="1D6CC497" w15:done="0"/>
+  <w15:commentEx w15:paraId="09F1B896" w15:done="0"/>
+  <w15:commentEx w15:paraId="167E4D40" w15:done="0"/>
+</w15:commentsEx>
+</file>
+
+<file path=word/commentsExtensible.xml><?xml version="1.0" encoding="utf-8"?>
+<w16cex:commentsExtensible xmlns:wpc="http://schemas.microsoft.com/office/word/2010/wordprocessingCanvas" xmlns:cx="http://schemas.microsoft.com/office/drawing/2014/chartex" xmlns:cx1="http://schemas.microsoft.com/office/drawing/2015/9/8/chartex" xmlns:cx2="http://schemas.microsoft.com/office/drawing/2015/10/21/chartex" xmlns:cx3="http://schemas.microsoft.com/office/drawing/2016/5/9/chartex" xmlns:cx4="http://schemas.microsoft.com/office/drawing/2016/5/10/chartex" xmlns:cx5="http://schemas.microsoft.com/office/drawing/2016/5/11/chartex" xmlns:cx6="http://schemas.microsoft.com/office/drawing/2016/5/12/chartex" xmlns:cx7="http://schemas.microsoft.com/office/drawing/2016/5/13/chartex" xmlns:cx8="http://schemas.microsoft.com/office/drawing/2016/5/14/chartex" xmlns:cr="http://schemas.microsoft.com/office/comments/2020/reactions" xmlns:mc="http://schemas.openxmlformats.org/markup-compatibility/2006" xmlns:aink="http://schemas.microsoft.com/office/drawing/2016/ink" xmlns:am3d="http://schemas.microsoft.com/office/drawing/2017/model3d" xmlns:o="urn:schemas-microsoft-com:office:office" xmlns:oel="http://schemas.microsoft.com/office/2019/extlst" xmlns:r="http://schemas.openxmlformats.org/officeDocument/2006/relationships" xmlns:m="http://schemas.openxmlformats.org/officeDocument/2006/math" xmlns:v="urn:schemas-microsoft-com:vml" xmlns:wp14="http://schemas.microsoft.com/office/word/2010/wordprocessingDrawing" xmlns:wp="http://schemas.openxmlformats.org/drawingml/2006/wordprocessingDrawing" xmlns:w10="urn:schemas-microsoft-com:office:word" xmlns:w="http://schemas.openxmlformats.org/wordprocessingml/2006/main" xmlns:w14="http://schemas.microsoft.com/office/word/2010/wordml" xmlns:w15="http://schemas.microsoft.com/office/word/2012/wordml" xmlns:w16cex="http://schemas.microsoft.com/office/word/2018/wordml/cex" xmlns:w16cid="http://schemas.microsoft.com/office/word/2016/wordml/cid" xmlns:w16="http://schemas.microsoft.com/office/word/2018/wordml" xmlns:w16du="http://schemas.microsoft.com/office/word/2023/wordml/word16du" xmlns:w16sdtdh="http://schemas.microsoft.com/office/word/2020/wordml/sdtdatahash" xmlns:w16sdtfl="http://schemas.microsoft.com/office/word/2024/wordml/sdtformatlock" xmlns:w16se="http://schemas.microsoft.com/office/word/2015/wordml/symex" xmlns:wpg="http://schemas.microsoft.com/office/word/2010/wordprocessingGroup" xmlns:wpi="http://schemas.microsoft.com/office/word/2010/wordprocessingInk" xmlns:wne="http://schemas.microsoft.com/office/word/2006/wordml" xmlns:wps="http://schemas.microsoft.com/office/word/2010/wordprocessingShape" mc:Ignorable="w14 w15 w16se w16cid w16 w16cex w16sdtdh w16sdtfl cr w16du wp14">
+  <w16cex:commentExtensible w16cex:durableId="0663976E" w16cex:dateUtc="2025-11-04T19:19:00Z"/>
+  <w16cex:commentExtensible w16cex:durableId="158213E2" w16cex:dateUtc="2025-10-14T16:34:00Z"/>
+  <w16cex:commentExtensible w16cex:durableId="74433AC8" w16cex:dateUtc="2025-11-04T20:35:00Z"/>
+  <w16cex:commentExtensible w16cex:durableId="39210DD4" w16cex:dateUtc="2025-11-04T20:40:00Z"/>
+  <w16cex:commentExtensible w16cex:durableId="33BDE223" w16cex:dateUtc="2025-11-05T16:12:00Z"/>
+</w16cex:commentsExtensible>
+</file>
+
+<file path=word/commentsIds.xml><?xml version="1.0" encoding="utf-8"?>
+<w16cid:commentsIds xmlns:wpc="http://schemas.microsoft.com/office/word/2010/wordprocessingCanvas" xmlns:cx="http://schemas.microsoft.com/office/drawing/2014/chartex" xmlns:cx1="http://schemas.microsoft.com/office/drawing/2015/9/8/chartex" xmlns:cx2="http://schemas.microsoft.com/office/drawing/2015/10/21/chartex" xmlns:cx3="http://schemas.microsoft.com/office/drawing/2016/5/9/chartex" xmlns:cx4="http://schemas.microsoft.com/office/drawing/2016/5/10/chartex" xmlns:cx5="http://schemas.microsoft.com/office/drawing/2016/5/11/chartex" xmlns:cx6="http://schemas.microsoft.com/office/drawing/2016/5/12/chartex" xmlns:cx7="http://schemas.microsoft.com/office/drawing/2016/5/13/chartex" xmlns:cx8="http://schemas.microsoft.com/office/drawing/2016/5/14/chartex" xmlns:mc="http://schemas.openxmlformats.org/markup-compatibility/2006" xmlns:aink="http://schemas.microsoft.com/office/drawing/2016/ink" xmlns:am3d="http://schemas.microsoft.com/office/drawing/2017/model3d" xmlns:o="urn:schemas-microsoft-com:office:office" xmlns:oel="http://schemas.microsoft.com/office/2019/extlst" xmlns:r="http://schemas.openxmlformats.org/officeDocument/2006/relationships" xmlns:m="http://schemas.openxmlformats.org/officeDocument/2006/math" xmlns:v="urn:schemas-microsoft-com:vml" xmlns:wp14="http://schemas.microsoft.com/office/word/2010/wordprocessingDrawing" xmlns:wp="http://schemas.openxmlformats.org/drawingml/2006/wordprocessingDrawing" xmlns:w10="urn:schemas-microsoft-com:office:word" xmlns:w="http://schemas.openxmlformats.org/wordprocessingml/2006/main" xmlns:w14="http://schemas.microsoft.com/office/word/2010/wordml" xmlns:w15="http://schemas.microsoft.com/office/word/2012/wordml" xmlns:w16cex="http://schemas.microsoft.com/office/word/2018/wordml/cex" xmlns:w16cid="http://schemas.microsoft.com/office/word/2016/wordml/cid" xmlns:w16="http://schemas.microsoft.com/office/word/2018/wordml" xmlns:w16du="http://schemas.microsoft.com/office/word/2023/wordml/word16du" xmlns:w16sdtdh="http://schemas.microsoft.com/office/word/2020/wordml/sdtdatahash" xmlns:w16sdtfl="http://schemas.microsoft.com/office/word/2024/wordml/sdtformatlock" xmlns:w16se="http://schemas.microsoft.com/office/word/2015/wordml/symex" xmlns:wpg="http://schemas.microsoft.com/office/word/2010/wordprocessingGroup" xmlns:wpi="http://schemas.microsoft.com/office/word/2010/wordprocessingInk" xmlns:wne="http://schemas.microsoft.com/office/word/2006/wordml" xmlns:wps="http://schemas.microsoft.com/office/word/2010/wordprocessingShape" mc:Ignorable="w14 w15 w16se w16cid w16 w16cex w16sdtdh w16sdtfl w16du wp14">
+  <w16cid:commentId w16cid:paraId="47D268E1" w16cid:durableId="0663976E"/>
+  <w16cid:commentId w16cid:paraId="4386FF68" w16cid:durableId="158213E2"/>
+  <w16cid:commentId w16cid:paraId="1D6CC497" w16cid:durableId="74433AC8"/>
+  <w16cid:commentId w16cid:paraId="09F1B896" w16cid:durableId="39210DD4"/>
+  <w16cid:commentId w16cid:paraId="167E4D40" w16cid:durableId="33BDE223"/>
+</w16cid:commentsIds>
 </file>
 
 <file path=word/numbering.xml><?xml version="1.0" encoding="utf-8"?>
@@ -4467,6 +6116,14 @@
     <w:abstractNumId w:val="0"/>
   </w:num>
 </w:numbering>
+</file>
+
+<file path=word/people.xml><?xml version="1.0" encoding="utf-8"?>
+<w15:people xmlns:wpc="http://schemas.microsoft.com/office/word/2010/wordprocessingCanvas" xmlns:cx="http://schemas.microsoft.com/office/drawing/2014/chartex" xmlns:cx1="http://schemas.microsoft.com/office/drawing/2015/9/8/chartex" xmlns:cx2="http://schemas.microsoft.com/office/drawing/2015/10/21/chartex" xmlns:cx3="http://schemas.microsoft.com/office/drawing/2016/5/9/chartex" xmlns:cx4="http://schemas.microsoft.com/office/drawing/2016/5/10/chartex" xmlns:cx5="http://schemas.microsoft.com/office/drawing/2016/5/11/chartex" xmlns:cx6="http://schemas.microsoft.com/office/drawing/2016/5/12/chartex" xmlns:cx7="http://schemas.microsoft.com/office/drawing/2016/5/13/chartex" xmlns:cx8="http://schemas.microsoft.com/office/drawing/2016/5/14/chartex" xmlns:mc="http://schemas.openxmlformats.org/markup-compatibility/2006" xmlns:aink="http://schemas.microsoft.com/office/drawing/2016/ink" xmlns:am3d="http://schemas.microsoft.com/office/drawing/2017/model3d" xmlns:o="urn:schemas-microsoft-com:office:office" xmlns:oel="http://schemas.microsoft.com/office/2019/extlst" xmlns:r="http://schemas.openxmlformats.org/officeDocument/2006/relationships" xmlns:m="http://schemas.openxmlformats.org/officeDocument/2006/math" xmlns:v="urn:schemas-microsoft-com:vml" xmlns:wp14="http://schemas.microsoft.com/office/word/2010/wordprocessingDrawing" xmlns:wp="http://schemas.openxmlformats.org/drawingml/2006/wordprocessingDrawing" xmlns:w10="urn:schemas-microsoft-com:office:word" xmlns:w="http://schemas.openxmlformats.org/wordprocessingml/2006/main" xmlns:w14="http://schemas.microsoft.com/office/word/2010/wordml" xmlns:w15="http://schemas.microsoft.com/office/word/2012/wordml" xmlns:w16cex="http://schemas.microsoft.com/office/word/2018/wordml/cex" xmlns:w16cid="http://schemas.microsoft.com/office/word/2016/wordml/cid" xmlns:w16="http://schemas.microsoft.com/office/word/2018/wordml" xmlns:w16du="http://schemas.microsoft.com/office/word/2023/wordml/word16du" xmlns:w16sdtdh="http://schemas.microsoft.com/office/word/2020/wordml/sdtdatahash" xmlns:w16sdtfl="http://schemas.microsoft.com/office/word/2024/wordml/sdtformatlock" xmlns:w16se="http://schemas.microsoft.com/office/word/2015/wordml/symex" xmlns:wpg="http://schemas.microsoft.com/office/word/2010/wordprocessingGroup" xmlns:wpi="http://schemas.microsoft.com/office/word/2010/wordprocessingInk" xmlns:wne="http://schemas.microsoft.com/office/word/2006/wordml" xmlns:wps="http://schemas.microsoft.com/office/word/2010/wordprocessingShape" mc:Ignorable="w14 w15 w16se w16cid w16 w16cex w16sdtdh w16sdtfl w16du wp14">
+  <w15:person w15:author="Volker Rudolf">
+    <w15:presenceInfo w15:providerId="AD" w15:userId="S::vr2@rice.edu::029f4023-4c01-4d97-9fb2-378d2d0f209e"/>
+  </w15:person>
+</w15:people>
 </file>
 
 <file path=word/styles.xml><?xml version="1.0" encoding="utf-8"?>
@@ -5509,6 +7166,48 @@
       <w:noProof/>
     </w:rPr>
   </w:style>
+  <w:style w:type="table" w:styleId="TableGrid">
+    <w:name w:val="Table Grid"/>
+    <w:basedOn w:val="TableNormal"/>
+    <w:uiPriority w:val="39"/>
+    <w:rsid w:val="001A1448"/>
+    <w:pPr>
+      <w:spacing w:after="0" w:line="240" w:lineRule="auto"/>
+    </w:pPr>
+    <w:tblPr>
+      <w:tblBorders>
+        <w:top w:val="single" w:sz="4" w:space="0" w:color="auto"/>
+        <w:left w:val="single" w:sz="4" w:space="0" w:color="auto"/>
+        <w:bottom w:val="single" w:sz="4" w:space="0" w:color="auto"/>
+        <w:right w:val="single" w:sz="4" w:space="0" w:color="auto"/>
+        <w:insideH w:val="single" w:sz="4" w:space="0" w:color="auto"/>
+        <w:insideV w:val="single" w:sz="4" w:space="0" w:color="auto"/>
+      </w:tblBorders>
+    </w:tblPr>
+  </w:style>
+  <w:style w:type="character" w:styleId="Hyperlink">
+    <w:name w:val="Hyperlink"/>
+    <w:basedOn w:val="DefaultParagraphFont"/>
+    <w:uiPriority w:val="99"/>
+    <w:unhideWhenUsed/>
+    <w:rsid w:val="000C0D42"/>
+    <w:rPr>
+      <w:color w:val="467886" w:themeColor="hyperlink"/>
+      <w:u w:val="single"/>
+    </w:rPr>
+  </w:style>
+  <w:style w:type="character" w:styleId="UnresolvedMention">
+    <w:name w:val="Unresolved Mention"/>
+    <w:basedOn w:val="DefaultParagraphFont"/>
+    <w:uiPriority w:val="99"/>
+    <w:semiHidden/>
+    <w:unhideWhenUsed/>
+    <w:rsid w:val="000C0D42"/>
+    <w:rPr>
+      <w:color w:val="605E5C"/>
+      <w:shd w:val="clear" w:color="auto" w:fill="E1DFDD"/>
+    </w:rPr>
+  </w:style>
 </w:styles>
 </file>
 

</xml_diff>